<commit_message>
feat(site): affiliate ads plugin, blog theme parts, local WP mirror, and video-worker updates
- New manifested-fit-affiliates WP plugin (Partner pick cards with AI placement)
- Blog theme header/footer/home templates, logo, and JS
- Docker-based local WordPress mirror for theme/plugin dev
- Video worker: local WAN video provider, resumable generation, branding assets
- FTP publish tool: add --ssl-no-revoke for Bluehost cert revocation checks
- Brain docs and session log updates

Co-Authored-By: Claude Fable 5 <noreply@anthropic.com>
</commit_message>
<xml_diff>
--- a/01_Admin/Manually_Copied_Context_Sessions/2026-07-06.docx
+++ b/01_Admin/Manually_Copied_Context_Sessions/2026-07-06.docx
@@ -618,7 +618,7 @@
       <w:pPr>
         <w:numPr>
           <w:ilvl w:val="0"/>
-          <w:numId w:val="7"/>
+          <w:numId w:val="16"/>
         </w:numPr>
       </w:pPr>
       <w:r>
@@ -629,7 +629,7 @@
       <w:pPr>
         <w:numPr>
           <w:ilvl w:val="0"/>
-          <w:numId w:val="7"/>
+          <w:numId w:val="16"/>
         </w:numPr>
       </w:pPr>
       <w:r>
@@ -640,7 +640,7 @@
       <w:pPr>
         <w:numPr>
           <w:ilvl w:val="0"/>
-          <w:numId w:val="7"/>
+          <w:numId w:val="16"/>
         </w:numPr>
       </w:pPr>
       <w:r>
@@ -651,7 +651,7 @@
       <w:pPr>
         <w:numPr>
           <w:ilvl w:val="0"/>
-          <w:numId w:val="7"/>
+          <w:numId w:val="16"/>
         </w:numPr>
       </w:pPr>
       <w:r>
@@ -672,7 +672,7 @@
       <w:pPr>
         <w:numPr>
           <w:ilvl w:val="0"/>
-          <w:numId w:val="7"/>
+          <w:numId w:val="16"/>
         </w:numPr>
       </w:pPr>
       <w:r>
@@ -782,10 +782,10 @@
       <w:r>
         <w:lastRenderedPageBreak/>
         <w:drawing>
-          <wp:inline distT="0" distB="0" distL="0" distR="0" wp14:anchorId="6E527F7E" wp14:editId="27C727D0">
+          <wp:inline distT="0" distB="0" distL="0" distR="0" wp14:anchorId="0AA6902A" wp14:editId="5FFABF84">
             <wp:extent cx="3757295" cy="8229600"/>
             <wp:effectExtent l="0" t="0" r="0" b="0"/>
-            <wp:docPr id="632137570" name="Picture 12"/>
+            <wp:docPr id="1131970529" name="Picture 12"/>
             <wp:cNvGraphicFramePr>
               <a:graphicFrameLocks xmlns:a="http://schemas.openxmlformats.org/drawingml/2006/main" noChangeAspect="1"/>
             </wp:cNvGraphicFramePr>
@@ -838,10 +838,10 @@
       <w:r>
         <w:lastRenderedPageBreak/>
         <w:drawing>
-          <wp:inline distT="0" distB="0" distL="0" distR="0" wp14:anchorId="6DF1EFB2" wp14:editId="2A3300CB">
+          <wp:inline distT="0" distB="0" distL="0" distR="0" wp14:anchorId="32F55B2C" wp14:editId="7C9B6B08">
             <wp:extent cx="3788410" cy="8229600"/>
             <wp:effectExtent l="0" t="0" r="2540" b="0"/>
-            <wp:docPr id="1808063409" name="Picture 11"/>
+            <wp:docPr id="634353926" name="Picture 11"/>
             <wp:cNvGraphicFramePr>
               <a:graphicFrameLocks xmlns:a="http://schemas.openxmlformats.org/drawingml/2006/main" noChangeAspect="1"/>
             </wp:cNvGraphicFramePr>
@@ -894,10 +894,10 @@
       <w:r>
         <w:lastRenderedPageBreak/>
         <w:drawing>
-          <wp:inline distT="0" distB="0" distL="0" distR="0" wp14:anchorId="7585614B" wp14:editId="5822DBD8">
+          <wp:inline distT="0" distB="0" distL="0" distR="0" wp14:anchorId="09B77E81" wp14:editId="170DB88D">
             <wp:extent cx="3837940" cy="8229600"/>
             <wp:effectExtent l="0" t="0" r="0" b="0"/>
-            <wp:docPr id="103398499" name="Picture 10"/>
+            <wp:docPr id="1904652699" name="Picture 10"/>
             <wp:cNvGraphicFramePr>
               <a:graphicFrameLocks xmlns:a="http://schemas.openxmlformats.org/drawingml/2006/main" noChangeAspect="1"/>
             </wp:cNvGraphicFramePr>
@@ -950,10 +950,10 @@
       <w:r>
         <w:lastRenderedPageBreak/>
         <w:drawing>
-          <wp:inline distT="0" distB="0" distL="0" distR="0" wp14:anchorId="18F26E2A" wp14:editId="2D894008">
+          <wp:inline distT="0" distB="0" distL="0" distR="0" wp14:anchorId="5F7CD455" wp14:editId="20F3C77D">
             <wp:extent cx="3782695" cy="8229600"/>
             <wp:effectExtent l="0" t="0" r="8255" b="0"/>
-            <wp:docPr id="1437787583" name="Picture 9"/>
+            <wp:docPr id="252907124" name="Picture 9"/>
             <wp:cNvGraphicFramePr>
               <a:graphicFrameLocks xmlns:a="http://schemas.openxmlformats.org/drawingml/2006/main" noChangeAspect="1"/>
             </wp:cNvGraphicFramePr>
@@ -1006,10 +1006,10 @@
       <w:r>
         <w:lastRenderedPageBreak/>
         <w:drawing>
-          <wp:inline distT="0" distB="0" distL="0" distR="0" wp14:anchorId="2778F4BC" wp14:editId="0FCDF5E9">
+          <wp:inline distT="0" distB="0" distL="0" distR="0" wp14:anchorId="52EAA6EE" wp14:editId="1C5E8FFF">
             <wp:extent cx="5943600" cy="3194685"/>
             <wp:effectExtent l="0" t="0" r="0" b="5715"/>
-            <wp:docPr id="1831729582" name="Picture 8"/>
+            <wp:docPr id="1486917646" name="Picture 8"/>
             <wp:cNvGraphicFramePr>
               <a:graphicFrameLocks xmlns:a="http://schemas.openxmlformats.org/drawingml/2006/main" noChangeAspect="1"/>
             </wp:cNvGraphicFramePr>
@@ -1192,7 +1192,7 @@
       <w:pPr>
         <w:numPr>
           <w:ilvl w:val="0"/>
-          <w:numId w:val="8"/>
+          <w:numId w:val="17"/>
         </w:numPr>
       </w:pPr>
       <w:r>
@@ -1210,7 +1210,7 @@
       <w:pPr>
         <w:numPr>
           <w:ilvl w:val="0"/>
-          <w:numId w:val="8"/>
+          <w:numId w:val="17"/>
         </w:numPr>
       </w:pPr>
       <w:r>
@@ -1289,10 +1289,10 @@
     <w:p>
       <w:r>
         <w:drawing>
-          <wp:inline distT="0" distB="0" distL="0" distR="0" wp14:anchorId="6651A1F7" wp14:editId="30B44BD5">
+          <wp:inline distT="0" distB="0" distL="0" distR="0" wp14:anchorId="0F12E170" wp14:editId="2EF8DDB7">
             <wp:extent cx="5943600" cy="3208655"/>
             <wp:effectExtent l="0" t="0" r="0" b="0"/>
-            <wp:docPr id="1141086549" name="Picture 7"/>
+            <wp:docPr id="627372832" name="Picture 7"/>
             <wp:cNvGraphicFramePr>
               <a:graphicFrameLocks xmlns:a="http://schemas.openxmlformats.org/drawingml/2006/main" noChangeAspect="1"/>
             </wp:cNvGraphicFramePr>
@@ -4857,7 +4857,7 @@
       <w:pPr>
         <w:numPr>
           <w:ilvl w:val="0"/>
-          <w:numId w:val="9"/>
+          <w:numId w:val="18"/>
         </w:numPr>
       </w:pPr>
       <w:hyperlink r:id="rId29" w:tgtFrame="_blank" w:history="1">
@@ -4920,7 +4920,7 @@
       <w:pPr>
         <w:numPr>
           <w:ilvl w:val="0"/>
-          <w:numId w:val="9"/>
+          <w:numId w:val="18"/>
         </w:numPr>
       </w:pPr>
       <w:hyperlink r:id="rId30" w:tgtFrame="_blank" w:history="1">
@@ -4939,7 +4939,7 @@
       <w:pPr>
         <w:numPr>
           <w:ilvl w:val="0"/>
-          <w:numId w:val="9"/>
+          <w:numId w:val="18"/>
         </w:numPr>
       </w:pPr>
       <w:hyperlink r:id="rId31" w:tgtFrame="_blank" w:history="1">
@@ -4989,7 +4989,7 @@
       <w:pPr>
         <w:numPr>
           <w:ilvl w:val="0"/>
-          <w:numId w:val="10"/>
+          <w:numId w:val="19"/>
         </w:numPr>
       </w:pPr>
       <w:r>
@@ -5007,7 +5007,7 @@
       <w:pPr>
         <w:numPr>
           <w:ilvl w:val="0"/>
-          <w:numId w:val="10"/>
+          <w:numId w:val="19"/>
         </w:numPr>
       </w:pPr>
       <w:r>
@@ -5025,7 +5025,7 @@
       <w:pPr>
         <w:numPr>
           <w:ilvl w:val="0"/>
-          <w:numId w:val="10"/>
+          <w:numId w:val="19"/>
         </w:numPr>
       </w:pPr>
       <w:r>
@@ -5056,7 +5056,7 @@
       <w:pPr>
         <w:numPr>
           <w:ilvl w:val="0"/>
-          <w:numId w:val="10"/>
+          <w:numId w:val="19"/>
         </w:numPr>
       </w:pPr>
       <w:r>
@@ -5067,7 +5067,7 @@
       <w:pPr>
         <w:numPr>
           <w:ilvl w:val="0"/>
-          <w:numId w:val="10"/>
+          <w:numId w:val="19"/>
         </w:numPr>
         <w:tabs>
           <w:tab w:val="clear" w:pos="720"/>
@@ -5081,7 +5081,7 @@
       <w:pPr>
         <w:numPr>
           <w:ilvl w:val="0"/>
-          <w:numId w:val="10"/>
+          <w:numId w:val="19"/>
         </w:numPr>
         <w:tabs>
           <w:tab w:val="clear" w:pos="720"/>
@@ -5095,7 +5095,7 @@
       <w:pPr>
         <w:numPr>
           <w:ilvl w:val="0"/>
-          <w:numId w:val="10"/>
+          <w:numId w:val="19"/>
         </w:numPr>
         <w:tabs>
           <w:tab w:val="clear" w:pos="720"/>
@@ -5109,7 +5109,7 @@
       <w:pPr>
         <w:numPr>
           <w:ilvl w:val="0"/>
-          <w:numId w:val="10"/>
+          <w:numId w:val="19"/>
         </w:numPr>
         <w:tabs>
           <w:tab w:val="clear" w:pos="720"/>
@@ -5123,7 +5123,7 @@
       <w:pPr>
         <w:numPr>
           <w:ilvl w:val="0"/>
-          <w:numId w:val="10"/>
+          <w:numId w:val="19"/>
         </w:numPr>
         <w:tabs>
           <w:tab w:val="clear" w:pos="720"/>
@@ -5137,7 +5137,7 @@
       <w:pPr>
         <w:numPr>
           <w:ilvl w:val="0"/>
-          <w:numId w:val="10"/>
+          <w:numId w:val="19"/>
         </w:numPr>
         <w:tabs>
           <w:tab w:val="clear" w:pos="720"/>
@@ -5151,7 +5151,7 @@
       <w:pPr>
         <w:numPr>
           <w:ilvl w:val="0"/>
-          <w:numId w:val="10"/>
+          <w:numId w:val="19"/>
         </w:numPr>
         <w:tabs>
           <w:tab w:val="clear" w:pos="720"/>
@@ -5165,7 +5165,7 @@
       <w:pPr>
         <w:numPr>
           <w:ilvl w:val="0"/>
-          <w:numId w:val="10"/>
+          <w:numId w:val="19"/>
         </w:numPr>
       </w:pPr>
       <w:r>
@@ -5266,7 +5266,7 @@
       <w:pPr>
         <w:numPr>
           <w:ilvl w:val="0"/>
-          <w:numId w:val="11"/>
+          <w:numId w:val="20"/>
         </w:numPr>
       </w:pPr>
       <w:r>
@@ -5287,7 +5287,7 @@
       <w:pPr>
         <w:numPr>
           <w:ilvl w:val="0"/>
-          <w:numId w:val="11"/>
+          <w:numId w:val="20"/>
         </w:numPr>
       </w:pPr>
       <w:r>
@@ -5305,7 +5305,7 @@
       <w:pPr>
         <w:numPr>
           <w:ilvl w:val="0"/>
-          <w:numId w:val="11"/>
+          <w:numId w:val="20"/>
         </w:numPr>
       </w:pPr>
       <w:r>
@@ -5684,7 +5684,7 @@
       <w:pPr>
         <w:numPr>
           <w:ilvl w:val="0"/>
-          <w:numId w:val="12"/>
+          <w:numId w:val="21"/>
         </w:numPr>
       </w:pPr>
       <w:r>
@@ -5703,7 +5703,7 @@
       <w:pPr>
         <w:numPr>
           <w:ilvl w:val="0"/>
-          <w:numId w:val="12"/>
+          <w:numId w:val="21"/>
         </w:numPr>
       </w:pPr>
       <w:r>
@@ -6242,7 +6242,7 @@
       <w:pPr>
         <w:numPr>
           <w:ilvl w:val="0"/>
-          <w:numId w:val="13"/>
+          <w:numId w:val="22"/>
         </w:numPr>
       </w:pPr>
       <w:r>
@@ -6260,7 +6260,7 @@
       <w:pPr>
         <w:numPr>
           <w:ilvl w:val="0"/>
-          <w:numId w:val="13"/>
+          <w:numId w:val="22"/>
         </w:numPr>
       </w:pPr>
       <w:r>
@@ -6278,7 +6278,7 @@
       <w:pPr>
         <w:numPr>
           <w:ilvl w:val="0"/>
-          <w:numId w:val="13"/>
+          <w:numId w:val="22"/>
         </w:numPr>
       </w:pPr>
       <w:r>
@@ -6304,7 +6304,7 @@
       <w:pPr>
         <w:numPr>
           <w:ilvl w:val="0"/>
-          <w:numId w:val="14"/>
+          <w:numId w:val="23"/>
         </w:numPr>
       </w:pPr>
       <w:r>
@@ -6322,7 +6322,7 @@
       <w:pPr>
         <w:numPr>
           <w:ilvl w:val="0"/>
-          <w:numId w:val="14"/>
+          <w:numId w:val="23"/>
         </w:numPr>
       </w:pPr>
       <w:r>
@@ -7166,7 +7166,7 @@
       <w:pPr>
         <w:numPr>
           <w:ilvl w:val="0"/>
-          <w:numId w:val="15"/>
+          <w:numId w:val="24"/>
         </w:numPr>
       </w:pPr>
       <w:r>
@@ -7184,7 +7184,7 @@
       <w:pPr>
         <w:numPr>
           <w:ilvl w:val="0"/>
-          <w:numId w:val="15"/>
+          <w:numId w:val="24"/>
         </w:numPr>
       </w:pPr>
       <w:r>
@@ -7206,6 +7206,1951 @@
     <w:p>
       <w:r>
         <w:t>One suggestion since a lot got built today: this is a good moment to commit the working tree to git so the plugin has a checkpoint before you start testing it live. Want me to do that?</w:t>
+      </w:r>
+    </w:p>
+    <w:p>
+      <w:r>
+        <w:t>Yes please do a goood feat / chore etc commit to git and push</w:t>
+      </w:r>
+    </w:p>
+    <w:p>
+      <w:r>
+        <w:rPr>
+          <w:b/>
+          <w:bCs/>
+        </w:rPr>
+        <w:t>PowerShell </w:t>
+      </w:r>
+      <w:r>
+        <w:t>Show working tree status and recent commits</w:t>
+      </w:r>
+    </w:p>
+    <w:p>
+      <w:r>
+        <w:lastRenderedPageBreak/>
+        <w:t>IN</w:t>
+      </w:r>
+    </w:p>
+    <w:p>
+      <w:r>
+        <w:t>git status --porcelain; git log --oneline -3</w:t>
+      </w:r>
+    </w:p>
+    <w:p>
+      <w:r>
+        <w:t>OUT</w:t>
+      </w:r>
+    </w:p>
+    <w:p>
+      <w:r>
+        <w:t xml:space="preserve"> M .gitignore</w:t>
+      </w:r>
+    </w:p>
+    <w:p>
+      <w:r>
+        <w:t xml:space="preserve"> M Brain/CURRENT_STATE.md</w:t>
+      </w:r>
+    </w:p>
+    <w:p>
+      <w:r>
+        <w:t xml:space="preserve"> M Brain/TASKS.md</w:t>
+      </w:r>
+    </w:p>
+    <w:p>
+      <w:r>
+        <w:t xml:space="preserve"> M NEXT_CONTEXT_BRIEF.md</w:t>
+      </w:r>
+    </w:p>
+    <w:p>
+      <w:r>
+        <w:t>?? 01_Admin/Manually_Copied_Context_Sessions/</w:t>
+      </w:r>
+    </w:p>
+    <w:p>
+      <w:r>
+        <w:t>?? "01_Admin/NEXT_CONTEXT_BRIEF.md \342\200\224 the full ha.txt"</w:t>
+      </w:r>
+    </w:p>
+    <w:p>
+      <w:r>
+        <w:t>?? "01_Admin/Transcript from Claude Code faceless channel video.txt"</w:t>
+      </w:r>
+    </w:p>
+    <w:p>
+      <w:r>
+        <w:t>?? 03_Website/Backups/</w:t>
+      </w:r>
+    </w:p>
+    <w:p>
+      <w:r>
+        <w:t>?? 03_Website/wordpress/</w:t>
+      </w:r>
+    </w:p>
+    <w:p>
+      <w:r>
+        <w:t>?? 05_Content/blog/</w:t>
+      </w:r>
+    </w:p>
+    <w:p>
+      <w:r>
+        <w:t>?? 05_Content/lead-magnet/</w:t>
+      </w:r>
+    </w:p>
+    <w:p>
+      <w:r>
+        <w:t>?? "06_Planning/2026-06-11 where we left off.txt"</w:t>
+      </w:r>
+    </w:p>
+    <w:p>
+      <w:r>
+        <w:t>?? 06_Planning/ACTION_PLAN_2026-07.md</w:t>
+      </w:r>
+    </w:p>
+    <w:p>
+      <w:r>
+        <w:t>?? 06_Planning/reports/</w:t>
+      </w:r>
+    </w:p>
+    <w:p>
+      <w:r>
+        <w:t>?? 07_Deploy/tools/push-draft.ps1</w:t>
+      </w:r>
+    </w:p>
+    <w:p>
+      <w:r>
+        <w:t>?? "Media/7 day reset/"</w:t>
+      </w:r>
+    </w:p>
+    <w:p>
+      <w:r>
+        <w:t>3cd7395 Prepare affiliate application readiness handoff</w:t>
+      </w:r>
+    </w:p>
+    <w:p>
+      <w:r>
+        <w:t>eaa2ee1 Add affiliate resources hub</w:t>
+      </w:r>
+    </w:p>
+    <w:p>
+      <w:r>
+        <w:t>25dc19b Record production FTP publish status</w:t>
+      </w:r>
+    </w:p>
+    <w:p>
+      <w:r>
+        <w:rPr>
+          <w:b/>
+          <w:bCs/>
+        </w:rPr>
+        <w:t>PowerShell </w:t>
+      </w:r>
+      <w:r>
+        <w:t>Inspect gitignore diff and sizes of ambiguous untracked folders</w:t>
+      </w:r>
+    </w:p>
+    <w:p>
+      <w:r>
+        <w:t>IN</w:t>
+      </w:r>
+    </w:p>
+    <w:p>
+      <w:r>
+        <w:t>git diff .gitignore; "---"; Get-ChildItem "03_Website/Backups" -Recurse -File | Measure-Object -Sum Length | Select-Object Count, @{n='MB';e={[math]::Round($_.Sum/1MB,1)}}; Get-ChildItem "Media/7 day reset" -Recurse -File | Measure-Object -Sum Length | Select-Object Count, @{n='MB';e={[math]::Round($_.Sum/1MB,1)}}; Get-ChildItem "03_Website/wordpress" -Recurse -File | Select-Object -ExpandProperty FullName | ForEach-Object { $_.Substring($_.IndexOf('wordpress')) }</w:t>
+      </w:r>
+    </w:p>
+    <w:p>
+      <w:r>
+        <w:t>OUT</w:t>
+      </w:r>
+    </w:p>
+    <w:p>
+      <w:r>
+        <w:lastRenderedPageBreak/>
+        <w:t>warning: in the working copy of '.gitignore', LF will be replaced by CRLF the next time Git touches it</w:t>
+      </w:r>
+    </w:p>
+    <w:p>
+      <w:r>
+        <w:t>diff --git a/.gitignore b/.gitignore</w:t>
+      </w:r>
+    </w:p>
+    <w:p>
+      <w:r>
+        <w:t>index d5a9e0b..a9630eb 100644</w:t>
+      </w:r>
+    </w:p>
+    <w:p>
+      <w:r>
+        <w:t>--- a/.gitignore</w:t>
+      </w:r>
+    </w:p>
+    <w:p>
+      <w:r>
+        <w:t>+++ b/.gitignore</w:t>
+      </w:r>
+    </w:p>
+    <w:p>
+      <w:r>
+        <w:t>@@ -3,6 +3,10 @@</w:t>
+      </w:r>
+    </w:p>
+    <w:p>
+      <w:r>
+        <w:t xml:space="preserve"> 01_Admin/WebHelper.txt</w:t>
+      </w:r>
+    </w:p>
+    <w:p>
+      <w:r>
+        <w:t xml:space="preserve"> 01_Admin/*credential*</w:t>
+      </w:r>
+    </w:p>
+    <w:p>
+      <w:r>
+        <w:t xml:space="preserve"> 01_Admin/*password*</w:t>
+      </w:r>
+    </w:p>
+    <w:p>
+      <w:r>
+        <w:t>+03_Website/Admin/</w:t>
+      </w:r>
+    </w:p>
+    <w:p>
+      <w:r>
+        <w:t>+**/Cred.txt</w:t>
+      </w:r>
+    </w:p>
+    <w:p>
+      <w:r>
+        <w:t>+**/*credential*</w:t>
+      </w:r>
+    </w:p>
+    <w:p>
+      <w:r>
+        <w:t>+**/*password*</w:t>
+      </w:r>
+    </w:p>
+    <w:p>
+      <w:r>
+        <w:t xml:space="preserve"> .env</w:t>
+      </w:r>
+    </w:p>
+    <w:p>
+      <w:r>
+        <w:t xml:space="preserve"> .env.*</w:t>
+      </w:r>
+    </w:p>
+    <w:p>
+      <w:r>
+        <w:t xml:space="preserve"> !.env.example</w:t>
+      </w:r>
+    </w:p>
+    <w:p>
+      <w:r>
+        <w:t>---</w:t>
+      </w:r>
+    </w:p>
+    <w:p/>
+    <w:p>
+      <w:r>
+        <w:t>Count  MB</w:t>
+      </w:r>
+    </w:p>
+    <w:p>
+      <w:r>
+        <w:t>-----  --</w:t>
+      </w:r>
+    </w:p>
+    <w:p>
+      <w:r>
+        <w:t xml:space="preserve">   17 0.4</w:t>
+      </w:r>
+    </w:p>
+    <w:p>
+      <w:r>
+        <w:t xml:space="preserve">    2 4.3</w:t>
+      </w:r>
+    </w:p>
+    <w:p>
+      <w:r>
+        <w:t>wordpress\plugins\manifested-fit-content-engine\cron-runner.php</w:t>
+      </w:r>
+    </w:p>
+    <w:p>
+      <w:r>
+        <w:t>wordpress\plugins\manifested-fit-content-engine\manifested-fit-content-engine.php</w:t>
+      </w:r>
+    </w:p>
+    <w:p>
+      <w:r>
+        <w:t>wordpress\plugins\manifested-fit-content-engine\README.md</w:t>
+      </w:r>
+    </w:p>
+    <w:p>
+      <w:r>
+        <w:t>wordpress\themes\manifestedfit-blog\functions.php</w:t>
+      </w:r>
+    </w:p>
+    <w:p>
+      <w:r>
+        <w:t>wordpress\themes\manifestedfit-blog\README.md</w:t>
+      </w:r>
+    </w:p>
+    <w:p>
+      <w:r>
+        <w:t>wordpress\themes\manifestedfit-blog\style.css</w:t>
+      </w:r>
+    </w:p>
+    <w:p>
+      <w:r>
+        <w:t>wordpress\themes\manifestedfit-blog\theme.json</w:t>
+      </w:r>
+    </w:p>
+    <w:p>
+      <w:r>
+        <w:rPr>
+          <w:b/>
+          <w:bCs/>
+        </w:rPr>
+        <w:lastRenderedPageBreak/>
+        <w:t>PowerShell </w:t>
+      </w:r>
+      <w:r>
+        <w:t>List contents of remaining untracked folders</w:t>
+      </w:r>
+    </w:p>
+    <w:p>
+      <w:r>
+        <w:t>IN</w:t>
+      </w:r>
+    </w:p>
+    <w:p>
+      <w:r>
+        <w:t>Get-ChildItem "03_Website/Backups" -Recurse -File | Select-Object -ExpandProperty FullName | ForEach-Object { $_.Substring($_.IndexOf('Backups')) }; "---"; Get-ChildItem "01_Admin/Manually_Copied_Context_Sessions" -File | Select-Object Name, @{n='KB';e={[math]::Round($_.Length/1KB)}}; "---"; Get-ChildItem "Media/7 day reset" -Recurse -File | Select-Object Name; "---"; Get-ChildItem "06_Planning/reports","05_Content" -Recurse -File | Select-Object -ExpandProperty FullName | ForEach-Object { $_.Substring(($_.IndexOf('Manifested_Fit')+15)) }</w:t>
+      </w:r>
+    </w:p>
+    <w:p>
+      <w:r>
+        <w:t>OUT</w:t>
+      </w:r>
+    </w:p>
+    <w:p>
+      <w:r>
+        <w:t>Backups\2026-07-05\.htaccess</w:t>
+      </w:r>
+    </w:p>
+    <w:p>
+      <w:r>
+        <w:t>Backups\2026-07-05\index.html</w:t>
+      </w:r>
+    </w:p>
+    <w:p>
+      <w:r>
+        <w:t>Backups\2026-07-05\api\collect-lead.php</w:t>
+      </w:r>
+    </w:p>
+    <w:p>
+      <w:r>
+        <w:t>Backups\2026-07-05\assets\css\styles.css</w:t>
+      </w:r>
+    </w:p>
+    <w:p>
+      <w:r>
+        <w:t>Backups\2026-07-05\assets\images\manifested-fit-logo.png</w:t>
+      </w:r>
+    </w:p>
+    <w:p>
+      <w:r>
+        <w:t>Backups\2026-07-05\assets\js\affiliate-offers.js</w:t>
+      </w:r>
+    </w:p>
+    <w:p>
+      <w:r>
+        <w:t>Backups\2026-07-05\assets\js\config.js</w:t>
+      </w:r>
+    </w:p>
+    <w:p>
+      <w:r>
+        <w:t>Backups\2026-07-05\assets\js\lead-magnet.js</w:t>
+      </w:r>
+    </w:p>
+    <w:p>
+      <w:r>
+        <w:t>Backups\2026-07-05\assets\js\resources.js</w:t>
+      </w:r>
+    </w:p>
+    <w:p>
+      <w:r>
+        <w:t>Backups\2026-07-05\assets\js\site.js</w:t>
+      </w:r>
+    </w:p>
+    <w:p>
+      <w:r>
+        <w:t>Backups\2026-07-05\lead-magnet\index.html</w:t>
+      </w:r>
+    </w:p>
+    <w:p>
+      <w:r>
+        <w:t>Backups\2026-07-05\legal\affiliate-disclosure.html</w:t>
+      </w:r>
+    </w:p>
+    <w:p>
+      <w:r>
+        <w:t>Backups\2026-07-05\legal\privacy.html</w:t>
+      </w:r>
+    </w:p>
+    <w:p>
+      <w:r>
+        <w:t>Backups\2026-07-05\resources\index.html</w:t>
+      </w:r>
+    </w:p>
+    <w:p>
+      <w:r>
+        <w:t>Backups\2026-07-05\storage\.gitkeep</w:t>
+      </w:r>
+    </w:p>
+    <w:p>
+      <w:r>
+        <w:t>Backups\2026-07-05\storage\.htaccess</w:t>
+      </w:r>
+    </w:p>
+    <w:p>
+      <w:r>
+        <w:t>Backups\2026-07-05\thank-you\index.html</w:t>
+      </w:r>
+    </w:p>
+    <w:p>
+      <w:r>
+        <w:t>---</w:t>
+      </w:r>
+    </w:p>
+    <w:p/>
+    <w:p>
+      <w:r>
+        <w:t>Name                   KB</w:t>
+      </w:r>
+    </w:p>
+    <w:p>
+      <w:r>
+        <w:t>----                   --</w:t>
+      </w:r>
+    </w:p>
+    <w:p>
+      <w:r>
+        <w:lastRenderedPageBreak/>
+        <w:t>2026-07-06 notes.txt    3</w:t>
+      </w:r>
+    </w:p>
+    <w:p>
+      <w:r>
+        <w:t>2026-07-06.docx      1622</w:t>
+      </w:r>
+    </w:p>
+    <w:p>
+      <w:r>
+        <w:t>---</w:t>
+      </w:r>
+    </w:p>
+    <w:p>
+      <w:r>
+        <w:t xml:space="preserve">summary 2.png            </w:t>
+      </w:r>
+    </w:p>
+    <w:p>
+      <w:r>
+        <w:t xml:space="preserve">summary image.png        </w:t>
+      </w:r>
+    </w:p>
+    <w:p>
+      <w:r>
+        <w:t>---</w:t>
+      </w:r>
+    </w:p>
+    <w:p>
+      <w:r>
+        <w:t>06_Planning\reports\weekly-report-2026-07-05.md</w:t>
+      </w:r>
+    </w:p>
+    <w:p>
+      <w:r>
+        <w:t>05_Content\blog\authors-and-schedule.md</w:t>
+      </w:r>
+    </w:p>
+    <w:p>
+      <w:r>
+        <w:t>05_Content\blog\categories.md</w:t>
+      </w:r>
+    </w:p>
+    <w:p>
+      <w:r>
+        <w:t>05_Content\blog\post-01-morning-reset-ritual.md</w:t>
+      </w:r>
+    </w:p>
+    <w:p>
+      <w:r>
+        <w:t>05_Content\blog\post-01-voice-variations.md</w:t>
+      </w:r>
+    </w:p>
+    <w:p>
+      <w:r>
+        <w:t>05_Content\blog\_sample-push-test.md</w:t>
+      </w:r>
+    </w:p>
+    <w:p>
+      <w:r>
+        <w:t>05_Content\email\sequence_draft.md</w:t>
+      </w:r>
+    </w:p>
+    <w:p>
+      <w:r>
+        <w:t>05_Content\lead-magnet\7-day-reset-content.md</w:t>
+      </w:r>
+    </w:p>
+    <w:p>
+      <w:r>
+        <w:t>05_Content\pinterest\pin_prompt_bank.md</w:t>
+      </w:r>
+    </w:p>
+    <w:p>
+      <w:r>
+        <w:t>05_Content\video-shorts\shorts_seed_ideas.md</w:t>
+      </w:r>
+    </w:p>
+    <w:p>
+      <w:r>
+        <w:rPr>
+          <w:b/>
+          <w:bCs/>
+        </w:rPr>
+        <w:t>Grep</w:t>
+      </w:r>
+      <w:r>
+        <w:t> "(api[_-]?key|password|secret|token|sk-ant|AIza|Basic )" (in d:\JonoFiles\Projects\01_Business\Spinning_Monkey_Studios\02_Active_Projects\Manifested_Fit\03_Website\Backups)</w:t>
+      </w:r>
+    </w:p>
+    <w:p>
+      <w:r>
+        <w:t>1 line of output</w:t>
+      </w:r>
+    </w:p>
+    <w:p>
+      <w:r>
+        <w:rPr>
+          <w:b/>
+          <w:bCs/>
+        </w:rPr>
+        <w:t>Grep</w:t>
+      </w:r>
+      <w:r>
+        <w:t> "(sk-ant-|AIza[0-9A-Za-z_-]{10}|[0-9]{9,10}:AA[0-9A-Za-z_-]{20})" (in d:\JonoFiles\Projects\01_Business\Spinning_Monkey_Studios\02_Active_Projects\Manifested_Fit)</w:t>
+      </w:r>
+    </w:p>
+    <w:p>
+      <w:r>
+        <w:t>1 line of output</w:t>
+      </w:r>
+    </w:p>
+    <w:p>
+      <w:r>
+        <w:rPr>
+          <w:b/>
+          <w:bCs/>
+        </w:rPr>
+        <w:t>PowerShell </w:t>
+      </w:r>
+      <w:r>
+        <w:t>Confirm credential configs are gitignored</w:t>
+      </w:r>
+    </w:p>
+    <w:p>
+      <w:r>
+        <w:t>IN</w:t>
+      </w:r>
+    </w:p>
+    <w:p>
+      <w:r>
+        <w:t>git check-ignore -v 07_Deploy/targets/telegram/config.json 07_Deploy/targets/wordpress/config.json 07_Deploy/targets/prod/config.json</w:t>
+      </w:r>
+    </w:p>
+    <w:p>
+      <w:r>
+        <w:t>OUT</w:t>
+      </w:r>
+    </w:p>
+    <w:p>
+      <w:r>
+        <w:t>.gitignore:2:07_Deploy/targets/*/config.json</w:t>
+      </w:r>
+      <w:r>
+        <w:tab/>
+        <w:t>07_Deploy/targets/telegram/config.json</w:t>
+      </w:r>
+    </w:p>
+    <w:p>
+      <w:r>
+        <w:t>.gitignore:2:07_Deploy/targets/*/config.json</w:t>
+      </w:r>
+      <w:r>
+        <w:tab/>
+        <w:t>07_Deploy/targets/wordpress/config.json</w:t>
+      </w:r>
+    </w:p>
+    <w:p>
+      <w:r>
+        <w:lastRenderedPageBreak/>
+        <w:t>.gitignore:2:07_Deploy/targets/*/config.json</w:t>
+      </w:r>
+      <w:r>
+        <w:tab/>
+        <w:t>07_Deploy/targets/prod/config.json</w:t>
+      </w:r>
+    </w:p>
+    <w:p>
+      <w:r>
+        <w:rPr>
+          <w:b/>
+          <w:bCs/>
+        </w:rPr>
+        <w:t>PowerShell </w:t>
+      </w:r>
+      <w:r>
+        <w:t>Commit push-draft tool</w:t>
+      </w:r>
+    </w:p>
+    <w:p>
+      <w:r>
+        <w:t>IN</w:t>
+      </w:r>
+    </w:p>
+    <w:p>
+      <w:r>
+        <w:t>git add 07_Deploy/tools/push-draft.ps1; git commit -m @'</w:t>
+      </w:r>
+    </w:p>
+    <w:p>
+      <w:r>
+        <w:t>feat(deploy): add push-draft tool for WordPress drafts</w:t>
+      </w:r>
+    </w:p>
+    <w:p/>
+    <w:p>
+      <w:r>
+        <w:t>Parses Markdown front matter, converts to HTML, resolves or creates</w:t>
+      </w:r>
+    </w:p>
+    <w:p>
+      <w:r>
+        <w:t>categories by name (handles WP's HTML-entity-encoded names and recovers</w:t>
+      </w:r>
+    </w:p>
+    <w:p>
+      <w:r>
+        <w:t>from term_exists), and always posts as a DRAFT via the REST API.</w:t>
+      </w:r>
+    </w:p>
+    <w:p/>
+    <w:p>
+      <w:r>
+        <w:t>Co-Authored-By: Claude Fable 5 &lt;noreply@anthropic.com&gt;</w:t>
+      </w:r>
+    </w:p>
+    <w:p>
+      <w:r>
+        <w:t>'@</w:t>
+      </w:r>
+    </w:p>
+    <w:p>
+      <w:r>
+        <w:t>OUT</w:t>
+      </w:r>
+    </w:p>
+    <w:p>
+      <w:r>
+        <w:t>warning: in the working copy of '07_Deploy/tools/push-draft.ps1', LF will be replaced by CRLF the next time Git touches it</w:t>
+      </w:r>
+    </w:p>
+    <w:p>
+      <w:r>
+        <w:t>[main 31baefb] feat(deploy): add push-draft tool for WordPress drafts</w:t>
+      </w:r>
+    </w:p>
+    <w:p>
+      <w:r>
+        <w:t xml:space="preserve"> 1 file changed, 136 insertions(+)</w:t>
+      </w:r>
+    </w:p>
+    <w:p>
+      <w:r>
+        <w:t xml:space="preserve"> create mode 100644 07_Deploy/tools/push-draft.ps1</w:t>
+      </w:r>
+    </w:p>
+    <w:p>
+      <w:r>
+        <w:rPr>
+          <w:b/>
+          <w:bCs/>
+        </w:rPr>
+        <w:t>PowerShell </w:t>
+      </w:r>
+      <w:r>
+        <w:t>Commit theme and content engine plugin</w:t>
+      </w:r>
+    </w:p>
+    <w:p>
+      <w:r>
+        <w:t>IN</w:t>
+      </w:r>
+    </w:p>
+    <w:p>
+      <w:r>
+        <w:t>git add 03_Website/wordpress/themes; git commit -m @'</w:t>
+      </w:r>
+    </w:p>
+    <w:p>
+      <w:r>
+        <w:t>feat(blog): add manifestedfit-blog child theme</w:t>
+      </w:r>
+    </w:p>
+    <w:p/>
+    <w:p>
+      <w:r>
+        <w:t>Twenty Twenty-Five child theme carrying the brand palette (teal/green/</w:t>
+      </w:r>
+    </w:p>
+    <w:p>
+      <w:r>
+        <w:t>plum/cream) and typography for manifestedfit.com/blog.</w:t>
+      </w:r>
+    </w:p>
+    <w:p/>
+    <w:p>
+      <w:r>
+        <w:t>Co-Authored-By: Claude Fable 5 &lt;noreply@anthropic.com&gt;</w:t>
+      </w:r>
+    </w:p>
+    <w:p>
+      <w:r>
+        <w:t>'@; git add 03_Website/wordpress/plugins; git commit -m @'</w:t>
+      </w:r>
+    </w:p>
+    <w:p>
+      <w:r>
+        <w:t>feat(blog): add AI content engine plugin</w:t>
+      </w:r>
+    </w:p>
+    <w:p/>
+    <w:p>
+      <w:r>
+        <w:t>Supervised drafting engine for the blog: daily cron picks the day's</w:t>
+      </w:r>
+    </w:p>
+    <w:p>
+      <w:r>
+        <w:t>persona (Mon Frankie / Tue Dana / Wed Nadia / Thu Dana / Fri Rowan,</w:t>
+      </w:r>
+    </w:p>
+    <w:p>
+      <w:r>
+        <w:t>weekends random, Canadian holiday and solemn-day overrides), takes the</w:t>
+      </w:r>
+    </w:p>
+    <w:p>
+      <w:r>
+        <w:t>next queued topic, generates the post via structured JSON, and saves it</w:t>
+      </w:r>
+    </w:p>
+    <w:p>
+      <w:r>
+        <w:t>as a DRAFT under the persona byline with RankMath focus keyword set.</w:t>
+      </w:r>
+    </w:p>
+    <w:p/>
+    <w:p>
+      <w:r>
+        <w:t>Multi-provider: Anthropic (default claude-opus-4-8), Google Gemini,</w:t>
+      </w:r>
+    </w:p>
+    <w:p>
+      <w:r>
+        <w:t>OpenAI, Grok, or any OpenAI-compatible endpoint (e.g. Ollama on a VM)</w:t>
+      </w:r>
+    </w:p>
+    <w:p>
+      <w:r>
+        <w:t>with graceful json_schema -&gt; json_object -&gt; prompted-JSON degradation.</w:t>
+      </w:r>
+    </w:p>
+    <w:p/>
+    <w:p>
+      <w:r>
+        <w:t>Two-way Telegram: draft notices carry Publish/Keep/Trash buttons</w:t>
+      </w:r>
+    </w:p>
+    <w:p>
+      <w:r>
+        <w:t>(tapping Publish is the human approval - the engine never publishes on</w:t>
+      </w:r>
+    </w:p>
+    <w:p>
+      <w:r>
+        <w:t>its own), replying to a notice sends revision instructions to the AI,</w:t>
+      </w:r>
+    </w:p>
+    <w:p>
+      <w:r>
+        <w:t>and other messages get an AI chat reply. Webhook is secret-token</w:t>
+      </w:r>
+    </w:p>
+    <w:p>
+      <w:r>
+        <w:t>verified, chat-id restricted, and update-id deduplicated.</w:t>
+      </w:r>
+    </w:p>
+    <w:p/>
+    <w:p>
+      <w:r>
+        <w:t>Cron via secret-guarded REST endpoint or CLI cron-runner.php fallback.</w:t>
+      </w:r>
+    </w:p>
+    <w:p/>
+    <w:p>
+      <w:r>
+        <w:t>Co-Authored-By: Claude Fable 5 &lt;noreply@anthropic.com&gt;</w:t>
+      </w:r>
+    </w:p>
+    <w:p>
+      <w:r>
+        <w:t>'@</w:t>
+      </w:r>
+    </w:p>
+    <w:p>
+      <w:r>
+        <w:t>OUT</w:t>
+      </w:r>
+    </w:p>
+    <w:p>
+      <w:r>
+        <w:t>warning: in the working copy of '03_Website/wordpress/themes/manifestedfit-blog/README.md', LF will be replaced by CRLF the next time Git touches it</w:t>
+      </w:r>
+    </w:p>
+    <w:p>
+      <w:r>
+        <w:t>warning: in the working copy of '03_Website/wordpress/themes/manifestedfit-blog/functions.php', LF will be replaced by CRLF the next time Git touches it</w:t>
+      </w:r>
+    </w:p>
+    <w:p>
+      <w:r>
+        <w:t>warning: in the working copy of '03_Website/wordpress/themes/manifestedfit-blog/style.css', LF will be replaced by CRLF the next time Git touches it</w:t>
+      </w:r>
+    </w:p>
+    <w:p>
+      <w:r>
+        <w:t>warning: in the working copy of '03_Website/wordpress/themes/manifestedfit-blog/theme.json', LF will be replaced by CRLF the next time Git touches it</w:t>
+      </w:r>
+    </w:p>
+    <w:p>
+      <w:r>
+        <w:lastRenderedPageBreak/>
+        <w:t>[main 2e8b565] feat(blog): add manifestedfit-blog child theme</w:t>
+      </w:r>
+    </w:p>
+    <w:p>
+      <w:r>
+        <w:t xml:space="preserve"> 4 files changed, 209 insertions(+)</w:t>
+      </w:r>
+    </w:p>
+    <w:p>
+      <w:r>
+        <w:t xml:space="preserve"> create mode 100644 03_Website/wordpress/themes/manifestedfit-blog/README.md</w:t>
+      </w:r>
+    </w:p>
+    <w:p>
+      <w:r>
+        <w:t xml:space="preserve"> create mode 100644 03_Website/wordpress/themes/manifestedfit-blog/functions.php</w:t>
+      </w:r>
+    </w:p>
+    <w:p>
+      <w:r>
+        <w:t xml:space="preserve"> create mode 100644 03_Website/wordpress/themes/manifestedfit-blog/style.css</w:t>
+      </w:r>
+    </w:p>
+    <w:p>
+      <w:r>
+        <w:t xml:space="preserve"> create mode 100644 03_Website/wordpress/themes/manifestedfit-blog/theme.json</w:t>
+      </w:r>
+    </w:p>
+    <w:p>
+      <w:r>
+        <w:t>warning: in the working copy of '03_Website/wordpress/plugins/manifested-fit-content-engine/README.md', LF will be replaced by CRLF the next time Git touches it</w:t>
+      </w:r>
+    </w:p>
+    <w:p>
+      <w:r>
+        <w:t>warning: in the working copy of '03_Website/wordpress/plugins/manifested-fit-content-engine/cron-runner.php', LF will be replaced by CRLF the next time Git touches it</w:t>
+      </w:r>
+    </w:p>
+    <w:p>
+      <w:r>
+        <w:t>warning: in the working copy of '03_Website/wordpress/plugins/manifested-fit-content-engine/manifested-fit-content-engine.php', LF will be replaced by CRLF the next time Git touches it</w:t>
+      </w:r>
+    </w:p>
+    <w:p>
+      <w:r>
+        <w:t>[main d70bdad] feat(blog): add AI content engine plugin</w:t>
+      </w:r>
+    </w:p>
+    <w:p>
+      <w:r>
+        <w:t xml:space="preserve"> 3 files changed, 1254 insertions(+)</w:t>
+      </w:r>
+    </w:p>
+    <w:p>
+      <w:r>
+        <w:t xml:space="preserve"> create mode 100644 03_Website/wordpress/plugins/manifested-fit-content-engine/README.md</w:t>
+      </w:r>
+    </w:p>
+    <w:p>
+      <w:r>
+        <w:t xml:space="preserve"> create mode 100644 03_Website/wordpress/plugins/manifested-fit-content-engine/cron-runner.php</w:t>
+      </w:r>
+    </w:p>
+    <w:p>
+      <w:r>
+        <w:t xml:space="preserve"> create mode 100644 03_Website/wordpress/plugins/manifested-fit-content-engine/manifested-fit-content-engine.php</w:t>
+      </w:r>
+    </w:p>
+    <w:p>
+      <w:r>
+        <w:rPr>
+          <w:b/>
+          <w:bCs/>
+        </w:rPr>
+        <w:t>PowerShell </w:t>
+      </w:r>
+      <w:r>
+        <w:t>Commit content assets and planning docs</w:t>
+      </w:r>
+    </w:p>
+    <w:p>
+      <w:r>
+        <w:t>IN</w:t>
+      </w:r>
+    </w:p>
+    <w:p>
+      <w:r>
+        <w:t>git add 05_Content; git commit -m @'</w:t>
+      </w:r>
+    </w:p>
+    <w:p>
+      <w:r>
+        <w:t>feat(content): add blog voice team, first posts, and content seeds</w:t>
+      </w:r>
+    </w:p>
+    <w:p/>
+    <w:p>
+      <w:r>
+        <w:t>Columnist personas + posting schedule, category taxonomy, post 1 in</w:t>
+      </w:r>
+    </w:p>
+    <w:p>
+      <w:r>
+        <w:t>original and four-voice variants, 7-Day Reset lead magnet content,</w:t>
+      </w:r>
+    </w:p>
+    <w:p>
+      <w:r>
+        <w:t>email sequence draft, Pinterest and Shorts idea banks.</w:t>
+      </w:r>
+    </w:p>
+    <w:p/>
+    <w:p>
+      <w:r>
+        <w:t>Co-Authored-By: Claude Fable 5 &lt;noreply@anthropic.com&gt;</w:t>
+      </w:r>
+    </w:p>
+    <w:p>
+      <w:r>
+        <w:t>'@; git add 06_Planning "01_Admin"; git commit -m @'</w:t>
+      </w:r>
+    </w:p>
+    <w:p>
+      <w:r>
+        <w:t>docs(planning): July action plan, weekly report, and session notes</w:t>
+      </w:r>
+    </w:p>
+    <w:p/>
+    <w:p>
+      <w:r>
+        <w:t>Two-lane YouTube + blog strategy for July 2026, first weekly status</w:t>
+      </w:r>
+    </w:p>
+    <w:p>
+      <w:r>
+        <w:t>report, and archived session context/transcripts.</w:t>
+      </w:r>
+    </w:p>
+    <w:p/>
+    <w:p>
+      <w:r>
+        <w:t>Co-Authored-By: Claude Fable 5 &lt;noreply@anthropic.com&gt;</w:t>
+      </w:r>
+    </w:p>
+    <w:p>
+      <w:r>
+        <w:t>'@</w:t>
+      </w:r>
+    </w:p>
+    <w:p>
+      <w:r>
+        <w:t>OUT</w:t>
+      </w:r>
+    </w:p>
+    <w:p>
+      <w:r>
+        <w:t>warning: in the working copy of '05_Content/blog/_sample-push-test.md', LF will be replaced by CRLF the next time Git touches it</w:t>
+      </w:r>
+    </w:p>
+    <w:p>
+      <w:r>
+        <w:t>warning: in the working copy of '05_Content/blog/authors-and-schedule.md', LF will be replaced by CRLF the next time Git touches it</w:t>
+      </w:r>
+    </w:p>
+    <w:p>
+      <w:r>
+        <w:t>warning: in the working copy of '05_Content/blog/categories.md', LF will be replaced by CRLF the next time Git touches it</w:t>
+      </w:r>
+    </w:p>
+    <w:p>
+      <w:r>
+        <w:t>warning: in the working copy of '05_Content/blog/post-01-morning-reset-ritual.md', LF will be replaced by CRLF the next time Git touches it</w:t>
+      </w:r>
+    </w:p>
+    <w:p>
+      <w:r>
+        <w:t>warning: in the working copy of '05_Content/blog/post-01-voice-variations.md', LF will be replaced by CRLF the next time Git touches it</w:t>
+      </w:r>
+    </w:p>
+    <w:p>
+      <w:r>
+        <w:t>warning: in the working copy of '05_Content/lead-magnet/7-day-reset-content.md', LF will be replaced by CRLF the next time Git touches it</w:t>
+      </w:r>
+    </w:p>
+    <w:p>
+      <w:r>
+        <w:t>[main 785cbee] feat(content): add blog voice team, first posts, and content seeds</w:t>
+      </w:r>
+    </w:p>
+    <w:p>
+      <w:r>
+        <w:t xml:space="preserve"> 6 files changed, 439 insertions(+)</w:t>
+      </w:r>
+    </w:p>
+    <w:p>
+      <w:r>
+        <w:t xml:space="preserve"> create mode 100644 05_Content/blog/_sample-push-test.md</w:t>
+      </w:r>
+    </w:p>
+    <w:p>
+      <w:r>
+        <w:t xml:space="preserve"> create mode 100644 05_Content/blog/authors-and-schedule.md</w:t>
+      </w:r>
+    </w:p>
+    <w:p>
+      <w:r>
+        <w:t xml:space="preserve"> create mode 100644 05_Content/blog/categories.md</w:t>
+      </w:r>
+    </w:p>
+    <w:p>
+      <w:r>
+        <w:t xml:space="preserve"> create mode 100644 05_Content/blog/post-01-morning-reset-ritual.md</w:t>
+      </w:r>
+    </w:p>
+    <w:p>
+      <w:r>
+        <w:t xml:space="preserve"> create mode 100644 05_Content/blog/post-01-voice-variations.md</w:t>
+      </w:r>
+    </w:p>
+    <w:p>
+      <w:r>
+        <w:t xml:space="preserve"> create mode 100644 05_Content/lead-magnet/7-day-reset-content.md</w:t>
+      </w:r>
+    </w:p>
+    <w:p>
+      <w:r>
+        <w:t>warning: in the working copy of '06_Planning/ACTION_PLAN_2026-07.md', LF will be replaced by CRLF the next time Git touches it</w:t>
+      </w:r>
+    </w:p>
+    <w:p>
+      <w:r>
+        <w:t>warning: in the working copy of '06_Planning/reports/weekly-report-2026-07-05.md', LF will be replaced by CRLF the next time Git touches it</w:t>
+      </w:r>
+    </w:p>
+    <w:p>
+      <w:r>
+        <w:t>[main 3d2acda] docs(planning): July action plan, weekly report, and session notes</w:t>
+      </w:r>
+    </w:p>
+    <w:p>
+      <w:r>
+        <w:lastRenderedPageBreak/>
+        <w:t xml:space="preserve"> 7 files changed, 408 insertions(+)</w:t>
+      </w:r>
+    </w:p>
+    <w:p>
+      <w:r>
+        <w:t xml:space="preserve"> create mode 100644 01_Admin/Manually_Copied_Context_Sessions/2026-07-06 notes.txt</w:t>
+      </w:r>
+    </w:p>
+    <w:p>
+      <w:r>
+        <w:t xml:space="preserve"> create mode 100644 01_Admin/Manually_Copied_Context_Sessions/2026-07-06.docx</w:t>
+      </w:r>
+    </w:p>
+    <w:p>
+      <w:r>
+        <w:t xml:space="preserve"> create mode 100644 "01_Admin/NEXT_CONTEXT_BRIEF.md \342\200\224 the full ha.txt"</w:t>
+      </w:r>
+    </w:p>
+    <w:p>
+      <w:r>
+        <w:t xml:space="preserve"> create mode 100644 01_Admin/Transcript from Claude Code faceless channel video.txt</w:t>
+      </w:r>
+    </w:p>
+    <w:p>
+      <w:r>
+        <w:t xml:space="preserve"> create mode 100644 06_Planning/2026-06-11 where we left off.txt</w:t>
+      </w:r>
+    </w:p>
+    <w:p>
+      <w:r>
+        <w:t xml:space="preserve"> create mode 100644 06_Planning/ACTION_PLAN_2026-07.md</w:t>
+      </w:r>
+    </w:p>
+    <w:p>
+      <w:r>
+        <w:t xml:space="preserve"> create mode 100644 06_Planning/reports/weekly-report-2026-07-05.md</w:t>
+      </w:r>
+    </w:p>
+    <w:p>
+      <w:r>
+        <w:rPr>
+          <w:b/>
+          <w:bCs/>
+        </w:rPr>
+        <w:t>PowerShell </w:t>
+      </w:r>
+      <w:r>
+        <w:t>Commit backups, media, and Brain/gitignore updates</w:t>
+      </w:r>
+    </w:p>
+    <w:p>
+      <w:r>
+        <w:t>IN</w:t>
+      </w:r>
+    </w:p>
+    <w:p>
+      <w:r>
+        <w:t>git add 03_Website/Backups "Media/7 day reset"; git commit -m @'</w:t>
+      </w:r>
+    </w:p>
+    <w:p>
+      <w:r>
+        <w:t>chore(site): snapshot flat funnel site pre-blog (2026-07-05) and reset media</w:t>
+      </w:r>
+    </w:p>
+    <w:p/>
+    <w:p>
+      <w:r>
+        <w:t>Co-Authored-By: Claude Fable 5 &lt;noreply@anthropic.com&gt;</w:t>
+      </w:r>
+    </w:p>
+    <w:p>
+      <w:r>
+        <w:t>'@; git add .gitignore Brain NEXT_CONTEXT_BRIEF.md; git commit -m @'</w:t>
+      </w:r>
+    </w:p>
+    <w:p>
+      <w:r>
+        <w:t>chore(brain): update context brief, tasks, and tighten gitignore</w:t>
+      </w:r>
+    </w:p>
+    <w:p/>
+    <w:p>
+      <w:r>
+        <w:t>Brief now records the 2026-07-06 session: push-draft category fix,</w:t>
+      </w:r>
+    </w:p>
+    <w:p>
+      <w:r>
+        <w:t>Telegram bot wiring (@ManifestedFitBot), content engine plugin build</w:t>
+      </w:r>
+    </w:p>
+    <w:p>
+      <w:r>
+        <w:t>with two-way approval and multi-provider support, and the remaining</w:t>
+      </w:r>
+    </w:p>
+    <w:p>
+      <w:r>
+        <w:t>go-live steps. Gitignore adds credential-pattern and site-admin rules.</w:t>
+      </w:r>
+    </w:p>
+    <w:p/>
+    <w:p>
+      <w:r>
+        <w:t>Co-Authored-By: Claude Fable 5 &lt;noreply@anthropic.com&gt;</w:t>
+      </w:r>
+    </w:p>
+    <w:p>
+      <w:r>
+        <w:t>'@; git status --porcelain</w:t>
+      </w:r>
+    </w:p>
+    <w:p>
+      <w:r>
+        <w:t>OUT</w:t>
+      </w:r>
+    </w:p>
+    <w:p>
+      <w:r>
+        <w:t>[main b870bd9] chore(site): snapshot flat funnel site pre-blog (2026-07-05) and reset media</w:t>
+      </w:r>
+    </w:p>
+    <w:p>
+      <w:r>
+        <w:t xml:space="preserve"> 19 files changed, 1465 insertions(+)</w:t>
+      </w:r>
+    </w:p>
+    <w:p>
+      <w:r>
+        <w:t xml:space="preserve"> create mode 100644 03_Website/Backups/2026-07-05/.htaccess</w:t>
+      </w:r>
+    </w:p>
+    <w:p>
+      <w:r>
+        <w:t xml:space="preserve"> create mode 100644 03_Website/Backups/2026-07-05/api/collect-lead.php</w:t>
+      </w:r>
+    </w:p>
+    <w:p>
+      <w:r>
+        <w:lastRenderedPageBreak/>
+        <w:t xml:space="preserve"> create mode 100644 03_Website/Backups/2026-07-05/assets/css/styles.css</w:t>
+      </w:r>
+    </w:p>
+    <w:p>
+      <w:r>
+        <w:t xml:space="preserve"> create mode 100644 03_Website/Backups/2026-07-05/assets/images/manifested-fit-logo.png</w:t>
+      </w:r>
+    </w:p>
+    <w:p>
+      <w:r>
+        <w:t xml:space="preserve"> create mode 100644 03_Website/Backups/2026-07-05/assets/js/affiliate-offers.js</w:t>
+      </w:r>
+    </w:p>
+    <w:p>
+      <w:r>
+        <w:t xml:space="preserve"> create mode 100644 03_Website/Backups/2026-07-05/assets/js/config.js</w:t>
+      </w:r>
+    </w:p>
+    <w:p>
+      <w:r>
+        <w:t xml:space="preserve"> create mode 100644 03_Website/Backups/2026-07-05/assets/js/lead-magnet.js</w:t>
+      </w:r>
+    </w:p>
+    <w:p>
+      <w:r>
+        <w:t xml:space="preserve"> create mode 100644 03_Website/Backups/2026-07-05/assets/js/resources.js</w:t>
+      </w:r>
+    </w:p>
+    <w:p>
+      <w:r>
+        <w:t xml:space="preserve"> create mode 100644 03_Website/Backups/2026-07-05/assets/js/site.js</w:t>
+      </w:r>
+    </w:p>
+    <w:p>
+      <w:r>
+        <w:t xml:space="preserve"> create mode 100644 03_Website/Backups/2026-07-05/index.html</w:t>
+      </w:r>
+    </w:p>
+    <w:p>
+      <w:r>
+        <w:t xml:space="preserve"> create mode 100644 03_Website/Backups/2026-07-05/lead-magnet/index.html</w:t>
+      </w:r>
+    </w:p>
+    <w:p>
+      <w:r>
+        <w:t xml:space="preserve"> create mode 100644 03_Website/Backups/2026-07-05/legal/affiliate-disclosure.html</w:t>
+      </w:r>
+    </w:p>
+    <w:p>
+      <w:r>
+        <w:t xml:space="preserve"> create mode 100644 03_Website/Backups/2026-07-05/legal/privacy.html</w:t>
+      </w:r>
+    </w:p>
+    <w:p>
+      <w:r>
+        <w:t xml:space="preserve"> create mode 100644 03_Website/Backups/2026-07-05/resources/index.html</w:t>
+      </w:r>
+    </w:p>
+    <w:p>
+      <w:r>
+        <w:t xml:space="preserve"> create mode 100644 03_Website/Backups/2026-07-05/storage/.gitkeep</w:t>
+      </w:r>
+    </w:p>
+    <w:p>
+      <w:r>
+        <w:t xml:space="preserve"> create mode 100644 03_Website/Backups/2026-07-05/storage/.htaccess</w:t>
+      </w:r>
+    </w:p>
+    <w:p>
+      <w:r>
+        <w:t xml:space="preserve"> create mode 100644 03_Website/Backups/2026-07-05/thank-you/index.html</w:t>
+      </w:r>
+    </w:p>
+    <w:p>
+      <w:r>
+        <w:t xml:space="preserve"> create mode 100644 Media/7 day reset/summary 2.png</w:t>
+      </w:r>
+    </w:p>
+    <w:p>
+      <w:r>
+        <w:t xml:space="preserve"> create mode 100644 Media/7 day reset/summary image.png</w:t>
+      </w:r>
+    </w:p>
+    <w:p>
+      <w:r>
+        <w:t>warning: in the working copy of '.gitignore', LF will be replaced by CRLF the next time Git touches it</w:t>
+      </w:r>
+    </w:p>
+    <w:p>
+      <w:r>
+        <w:t>warning: in the working copy of 'Brain/CURRENT_STATE.md', LF will be replaced by CRLF the next time Git touches it</w:t>
+      </w:r>
+    </w:p>
+    <w:p>
+      <w:r>
+        <w:t>warning: in the working copy of 'Brain/TASKS.md', LF will be replaced by CRLF the next time Git touches it</w:t>
+      </w:r>
+    </w:p>
+    <w:p>
+      <w:r>
+        <w:t>warning: in the working copy of 'NEXT_CONTEXT_BRIEF.md', LF will be replaced by CRLF the next time Git touches it</w:t>
+      </w:r>
+    </w:p>
+    <w:p>
+      <w:r>
+        <w:t>[main dadc2d9] chore(brain): update context brief, tasks, and tighten gitignore</w:t>
+      </w:r>
+    </w:p>
+    <w:p>
+      <w:r>
+        <w:t xml:space="preserve"> 4 files changed, 77 insertions(+), 39 deletions(-)</w:t>
+      </w:r>
+    </w:p>
+    <w:p>
+      <w:r>
+        <w:rPr>
+          <w:b/>
+          <w:bCs/>
+        </w:rPr>
+        <w:t>PowerShell </w:t>
+      </w:r>
+      <w:r>
+        <w:t>Push to origin and show the new commits</w:t>
+      </w:r>
+    </w:p>
+    <w:p>
+      <w:r>
+        <w:t>IN</w:t>
+      </w:r>
+    </w:p>
+    <w:p>
+      <w:r>
+        <w:t>git push origin main; git log --oneline -8</w:t>
+      </w:r>
+    </w:p>
+    <w:p>
+      <w:r>
+        <w:t>OUT</w:t>
+      </w:r>
+    </w:p>
+    <w:p>
+      <w:r>
+        <w:lastRenderedPageBreak/>
+        <w:t>fatal: unable to access 'https://github.com/Simian-Nexus/manifestedfit.git/': SSL certificate OpenSSL verify result: unable to get local issuer certificate (20)</w:t>
+      </w:r>
+    </w:p>
+    <w:p>
+      <w:r>
+        <w:t>dadc2d9 chore(brain): update context brief, tasks, and tighten gitignore</w:t>
+      </w:r>
+    </w:p>
+    <w:p>
+      <w:r>
+        <w:t>b870bd9 chore(site): snapshot flat funnel site pre-blog (2026-07-05) and reset media</w:t>
+      </w:r>
+    </w:p>
+    <w:p>
+      <w:r>
+        <w:t>3d2acda docs(planning): July action plan, weekly report, and session notes</w:t>
+      </w:r>
+    </w:p>
+    <w:p>
+      <w:r>
+        <w:t>785cbee feat(content): add blog voice team, first posts, and content seeds</w:t>
+      </w:r>
+    </w:p>
+    <w:p>
+      <w:r>
+        <w:t>d70bdad feat(blog): add AI content engine plugin</w:t>
+      </w:r>
+    </w:p>
+    <w:p>
+      <w:r>
+        <w:t>2e8b565 feat(blog): add manifestedfit-blog child theme</w:t>
+      </w:r>
+    </w:p>
+    <w:p>
+      <w:r>
+        <w:t>31baefb feat(deploy): add push-draft tool for WordPress drafts</w:t>
+      </w:r>
+    </w:p>
+    <w:p>
+      <w:r>
+        <w:t>3cd7395 Prepare affiliate application readiness handoff</w:t>
+      </w:r>
+    </w:p>
+    <w:p>
+      <w:r>
+        <w:rPr>
+          <w:b/>
+          <w:bCs/>
+        </w:rPr>
+        <w:t>PowerShell </w:t>
+      </w:r>
+      <w:r>
+        <w:t>Use Windows cert store for TLS and retry push</w:t>
+      </w:r>
+    </w:p>
+    <w:p>
+      <w:r>
+        <w:t>IN</w:t>
+      </w:r>
+    </w:p>
+    <w:p>
+      <w:r>
+        <w:t>git config http.sslBackend schannel; git push origin main</w:t>
+      </w:r>
+    </w:p>
+    <w:p>
+      <w:r>
+        <w:t>OUT</w:t>
+      </w:r>
+    </w:p>
+    <w:p>
+      <w:r>
+        <w:t>To https://github.com/Simian-Nexus/manifestedfit.git</w:t>
+      </w:r>
+    </w:p>
+    <w:p>
+      <w:r>
+        <w:t xml:space="preserve">   3cd7395..dadc2d9  main -&gt; main</w:t>
+      </w:r>
+    </w:p>
+    <w:p>
+      <w:r>
+        <w:t>Committed and pushed — main is now at dadc2d9 on github.com/Simian-Nexus/manifestedfit, seven conventional commits ahead of where it was:</w:t>
+      </w:r>
+    </w:p>
+    <w:tbl>
+      <w:tblPr>
+        <w:tblW w:w="0" w:type="auto"/>
+        <w:tblBorders>
+          <w:top w:val="single" w:sz="6" w:space="0" w:color="2A2B2C"/>
+          <w:left w:val="single" w:sz="6" w:space="0" w:color="2A2B2C"/>
+          <w:bottom w:val="single" w:sz="6" w:space="0" w:color="2A2B2C"/>
+          <w:right w:val="single" w:sz="6" w:space="0" w:color="2A2B2C"/>
+        </w:tblBorders>
+        <w:tblCellMar>
+          <w:top w:w="15" w:type="dxa"/>
+          <w:left w:w="15" w:type="dxa"/>
+          <w:bottom w:w="15" w:type="dxa"/>
+          <w:right w:w="15" w:type="dxa"/>
+        </w:tblCellMar>
+        <w:tblLook w:val="04A0" w:firstRow="1" w:lastRow="0" w:firstColumn="1" w:lastColumn="0" w:noHBand="0" w:noVBand="1"/>
+      </w:tblPr>
+      <w:tblGrid>
+        <w:gridCol w:w="1377"/>
+        <w:gridCol w:w="7967"/>
+      </w:tblGrid>
+      <w:tr>
+        <w:trPr>
+          <w:tblHeader/>
+        </w:trPr>
+        <w:tc>
+          <w:tcPr>
+            <w:tcW w:w="0" w:type="auto"/>
+            <w:tcBorders>
+              <w:top w:val="single" w:sz="6" w:space="0" w:color="2A2B2C"/>
+              <w:left w:val="single" w:sz="6" w:space="0" w:color="2A2B2C"/>
+              <w:bottom w:val="single" w:sz="6" w:space="0" w:color="2A2B2C"/>
+              <w:right w:val="single" w:sz="6" w:space="0" w:color="2A2B2C"/>
+            </w:tcBorders>
+            <w:tcMar>
+              <w:top w:w="30" w:type="dxa"/>
+              <w:left w:w="30" w:type="dxa"/>
+              <w:bottom w:w="30" w:type="dxa"/>
+              <w:right w:w="30" w:type="dxa"/>
+            </w:tcMar>
+            <w:vAlign w:val="center"/>
+            <w:hideMark/>
+          </w:tcPr>
+          <w:p>
+            <w:pPr>
+              <w:rPr>
+                <w:b/>
+                <w:bCs/>
+              </w:rPr>
+            </w:pPr>
+            <w:r>
+              <w:rPr>
+                <w:b/>
+                <w:bCs/>
+              </w:rPr>
+              <w:t>Commit</w:t>
+            </w:r>
+          </w:p>
+        </w:tc>
+        <w:tc>
+          <w:tcPr>
+            <w:tcW w:w="0" w:type="auto"/>
+            <w:tcBorders>
+              <w:top w:val="single" w:sz="6" w:space="0" w:color="2A2B2C"/>
+              <w:left w:val="single" w:sz="6" w:space="0" w:color="2A2B2C"/>
+              <w:bottom w:val="single" w:sz="6" w:space="0" w:color="2A2B2C"/>
+              <w:right w:val="single" w:sz="6" w:space="0" w:color="2A2B2C"/>
+            </w:tcBorders>
+            <w:tcMar>
+              <w:top w:w="30" w:type="dxa"/>
+              <w:left w:w="30" w:type="dxa"/>
+              <w:bottom w:w="30" w:type="dxa"/>
+              <w:right w:w="30" w:type="dxa"/>
+            </w:tcMar>
+            <w:vAlign w:val="center"/>
+            <w:hideMark/>
+          </w:tcPr>
+          <w:p>
+            <w:pPr>
+              <w:rPr>
+                <w:b/>
+                <w:bCs/>
+              </w:rPr>
+            </w:pPr>
+            <w:r>
+              <w:rPr>
+                <w:b/>
+                <w:bCs/>
+              </w:rPr>
+              <w:t>What it contains</w:t>
+            </w:r>
+          </w:p>
+        </w:tc>
+      </w:tr>
+      <w:tr>
+        <w:tc>
+          <w:tcPr>
+            <w:tcW w:w="0" w:type="auto"/>
+            <w:tcBorders>
+              <w:top w:val="single" w:sz="6" w:space="0" w:color="2A2B2C"/>
+              <w:left w:val="single" w:sz="6" w:space="0" w:color="2A2B2C"/>
+              <w:bottom w:val="single" w:sz="6" w:space="0" w:color="2A2B2C"/>
+              <w:right w:val="single" w:sz="6" w:space="0" w:color="2A2B2C"/>
+            </w:tcBorders>
+            <w:tcMar>
+              <w:top w:w="30" w:type="dxa"/>
+              <w:left w:w="30" w:type="dxa"/>
+              <w:bottom w:w="30" w:type="dxa"/>
+              <w:right w:w="30" w:type="dxa"/>
+            </w:tcMar>
+            <w:vAlign w:val="center"/>
+            <w:hideMark/>
+          </w:tcPr>
+          <w:p>
+            <w:r>
+              <w:t>feat(deploy)</w:t>
+            </w:r>
+          </w:p>
+        </w:tc>
+        <w:tc>
+          <w:tcPr>
+            <w:tcW w:w="0" w:type="auto"/>
+            <w:tcBorders>
+              <w:top w:val="single" w:sz="6" w:space="0" w:color="2A2B2C"/>
+              <w:left w:val="single" w:sz="6" w:space="0" w:color="2A2B2C"/>
+              <w:bottom w:val="single" w:sz="6" w:space="0" w:color="2A2B2C"/>
+              <w:right w:val="single" w:sz="6" w:space="0" w:color="2A2B2C"/>
+            </w:tcBorders>
+            <w:tcMar>
+              <w:top w:w="30" w:type="dxa"/>
+              <w:left w:w="30" w:type="dxa"/>
+              <w:bottom w:w="30" w:type="dxa"/>
+              <w:right w:w="30" w:type="dxa"/>
+            </w:tcMar>
+            <w:vAlign w:val="center"/>
+            <w:hideMark/>
+          </w:tcPr>
+          <w:p>
+            <w:r>
+              <w:t>push-draft.ps1 (with today's category fix baked in)</w:t>
+            </w:r>
+          </w:p>
+        </w:tc>
+      </w:tr>
+      <w:tr>
+        <w:tc>
+          <w:tcPr>
+            <w:tcW w:w="0" w:type="auto"/>
+            <w:tcBorders>
+              <w:top w:val="single" w:sz="6" w:space="0" w:color="2A2B2C"/>
+              <w:left w:val="single" w:sz="6" w:space="0" w:color="2A2B2C"/>
+              <w:bottom w:val="single" w:sz="6" w:space="0" w:color="2A2B2C"/>
+              <w:right w:val="single" w:sz="6" w:space="0" w:color="2A2B2C"/>
+            </w:tcBorders>
+            <w:tcMar>
+              <w:top w:w="30" w:type="dxa"/>
+              <w:left w:w="30" w:type="dxa"/>
+              <w:bottom w:w="30" w:type="dxa"/>
+              <w:right w:w="30" w:type="dxa"/>
+            </w:tcMar>
+            <w:vAlign w:val="center"/>
+            <w:hideMark/>
+          </w:tcPr>
+          <w:p>
+            <w:r>
+              <w:t>feat(blog)</w:t>
+            </w:r>
+          </w:p>
+        </w:tc>
+        <w:tc>
+          <w:tcPr>
+            <w:tcW w:w="0" w:type="auto"/>
+            <w:tcBorders>
+              <w:top w:val="single" w:sz="6" w:space="0" w:color="2A2B2C"/>
+              <w:left w:val="single" w:sz="6" w:space="0" w:color="2A2B2C"/>
+              <w:bottom w:val="single" w:sz="6" w:space="0" w:color="2A2B2C"/>
+              <w:right w:val="single" w:sz="6" w:space="0" w:color="2A2B2C"/>
+            </w:tcBorders>
+            <w:tcMar>
+              <w:top w:w="30" w:type="dxa"/>
+              <w:left w:w="30" w:type="dxa"/>
+              <w:bottom w:w="30" w:type="dxa"/>
+              <w:right w:w="30" w:type="dxa"/>
+            </w:tcMar>
+            <w:vAlign w:val="center"/>
+            <w:hideMark/>
+          </w:tcPr>
+          <w:p>
+            <w:r>
+              <w:t>the manifestedfit-blog child theme</w:t>
+            </w:r>
+          </w:p>
+        </w:tc>
+      </w:tr>
+      <w:tr>
+        <w:tc>
+          <w:tcPr>
+            <w:tcW w:w="0" w:type="auto"/>
+            <w:tcBorders>
+              <w:top w:val="single" w:sz="6" w:space="0" w:color="2A2B2C"/>
+              <w:left w:val="single" w:sz="6" w:space="0" w:color="2A2B2C"/>
+              <w:bottom w:val="single" w:sz="6" w:space="0" w:color="2A2B2C"/>
+              <w:right w:val="single" w:sz="6" w:space="0" w:color="2A2B2C"/>
+            </w:tcBorders>
+            <w:tcMar>
+              <w:top w:w="30" w:type="dxa"/>
+              <w:left w:w="30" w:type="dxa"/>
+              <w:bottom w:w="30" w:type="dxa"/>
+              <w:right w:w="30" w:type="dxa"/>
+            </w:tcMar>
+            <w:vAlign w:val="center"/>
+            <w:hideMark/>
+          </w:tcPr>
+          <w:p>
+            <w:r>
+              <w:t>feat(blog)</w:t>
+            </w:r>
+          </w:p>
+        </w:tc>
+        <w:tc>
+          <w:tcPr>
+            <w:tcW w:w="0" w:type="auto"/>
+            <w:tcBorders>
+              <w:top w:val="single" w:sz="6" w:space="0" w:color="2A2B2C"/>
+              <w:left w:val="single" w:sz="6" w:space="0" w:color="2A2B2C"/>
+              <w:bottom w:val="single" w:sz="6" w:space="0" w:color="2A2B2C"/>
+              <w:right w:val="single" w:sz="6" w:space="0" w:color="2A2B2C"/>
+            </w:tcBorders>
+            <w:tcMar>
+              <w:top w:w="30" w:type="dxa"/>
+              <w:left w:w="30" w:type="dxa"/>
+              <w:bottom w:w="30" w:type="dxa"/>
+              <w:right w:w="30" w:type="dxa"/>
+            </w:tcMar>
+            <w:vAlign w:val="center"/>
+            <w:hideMark/>
+          </w:tcPr>
+          <w:p>
+            <w:r>
+              <w:t>the content engine plugin — full description of the persona schedule, five providers, and two-way Telegram in the commit body</w:t>
+            </w:r>
+          </w:p>
+        </w:tc>
+      </w:tr>
+      <w:tr>
+        <w:tc>
+          <w:tcPr>
+            <w:tcW w:w="0" w:type="auto"/>
+            <w:tcBorders>
+              <w:top w:val="single" w:sz="6" w:space="0" w:color="2A2B2C"/>
+              <w:left w:val="single" w:sz="6" w:space="0" w:color="2A2B2C"/>
+              <w:bottom w:val="single" w:sz="6" w:space="0" w:color="2A2B2C"/>
+              <w:right w:val="single" w:sz="6" w:space="0" w:color="2A2B2C"/>
+            </w:tcBorders>
+            <w:tcMar>
+              <w:top w:w="30" w:type="dxa"/>
+              <w:left w:w="30" w:type="dxa"/>
+              <w:bottom w:w="30" w:type="dxa"/>
+              <w:right w:w="30" w:type="dxa"/>
+            </w:tcMar>
+            <w:vAlign w:val="center"/>
+            <w:hideMark/>
+          </w:tcPr>
+          <w:p>
+            <w:r>
+              <w:t>feat(content)</w:t>
+            </w:r>
+          </w:p>
+        </w:tc>
+        <w:tc>
+          <w:tcPr>
+            <w:tcW w:w="0" w:type="auto"/>
+            <w:tcBorders>
+              <w:top w:val="single" w:sz="6" w:space="0" w:color="2A2B2C"/>
+              <w:left w:val="single" w:sz="6" w:space="0" w:color="2A2B2C"/>
+              <w:bottom w:val="single" w:sz="6" w:space="0" w:color="2A2B2C"/>
+              <w:right w:val="single" w:sz="6" w:space="0" w:color="2A2B2C"/>
+            </w:tcBorders>
+            <w:tcMar>
+              <w:top w:w="30" w:type="dxa"/>
+              <w:left w:w="30" w:type="dxa"/>
+              <w:bottom w:w="30" w:type="dxa"/>
+              <w:right w:w="30" w:type="dxa"/>
+            </w:tcMar>
+            <w:vAlign w:val="center"/>
+            <w:hideMark/>
+          </w:tcPr>
+          <w:p>
+            <w:r>
+              <w:t>voice team, categories, post 1 + variants, 7-Day Reset content</w:t>
+            </w:r>
+          </w:p>
+        </w:tc>
+      </w:tr>
+      <w:tr>
+        <w:tc>
+          <w:tcPr>
+            <w:tcW w:w="0" w:type="auto"/>
+            <w:tcBorders>
+              <w:top w:val="single" w:sz="6" w:space="0" w:color="2A2B2C"/>
+              <w:left w:val="single" w:sz="6" w:space="0" w:color="2A2B2C"/>
+              <w:bottom w:val="single" w:sz="6" w:space="0" w:color="2A2B2C"/>
+              <w:right w:val="single" w:sz="6" w:space="0" w:color="2A2B2C"/>
+            </w:tcBorders>
+            <w:tcMar>
+              <w:top w:w="30" w:type="dxa"/>
+              <w:left w:w="30" w:type="dxa"/>
+              <w:bottom w:w="30" w:type="dxa"/>
+              <w:right w:w="30" w:type="dxa"/>
+            </w:tcMar>
+            <w:vAlign w:val="center"/>
+            <w:hideMark/>
+          </w:tcPr>
+          <w:p>
+            <w:r>
+              <w:t>docs(planning)</w:t>
+            </w:r>
+          </w:p>
+        </w:tc>
+        <w:tc>
+          <w:tcPr>
+            <w:tcW w:w="0" w:type="auto"/>
+            <w:tcBorders>
+              <w:top w:val="single" w:sz="6" w:space="0" w:color="2A2B2C"/>
+              <w:left w:val="single" w:sz="6" w:space="0" w:color="2A2B2C"/>
+              <w:bottom w:val="single" w:sz="6" w:space="0" w:color="2A2B2C"/>
+              <w:right w:val="single" w:sz="6" w:space="0" w:color="2A2B2C"/>
+            </w:tcBorders>
+            <w:tcMar>
+              <w:top w:w="30" w:type="dxa"/>
+              <w:left w:w="30" w:type="dxa"/>
+              <w:bottom w:w="30" w:type="dxa"/>
+              <w:right w:w="30" w:type="dxa"/>
+            </w:tcMar>
+            <w:vAlign w:val="center"/>
+            <w:hideMark/>
+          </w:tcPr>
+          <w:p>
+            <w:r>
+              <w:t>July action plan, weekly report, session notes/transcripts</w:t>
+            </w:r>
+          </w:p>
+        </w:tc>
+      </w:tr>
+      <w:tr>
+        <w:tc>
+          <w:tcPr>
+            <w:tcW w:w="0" w:type="auto"/>
+            <w:tcBorders>
+              <w:top w:val="single" w:sz="6" w:space="0" w:color="2A2B2C"/>
+              <w:left w:val="single" w:sz="6" w:space="0" w:color="2A2B2C"/>
+              <w:bottom w:val="single" w:sz="6" w:space="0" w:color="2A2B2C"/>
+              <w:right w:val="single" w:sz="6" w:space="0" w:color="2A2B2C"/>
+            </w:tcBorders>
+            <w:tcMar>
+              <w:top w:w="30" w:type="dxa"/>
+              <w:left w:w="30" w:type="dxa"/>
+              <w:bottom w:w="30" w:type="dxa"/>
+              <w:right w:w="30" w:type="dxa"/>
+            </w:tcMar>
+            <w:vAlign w:val="center"/>
+            <w:hideMark/>
+          </w:tcPr>
+          <w:p>
+            <w:r>
+              <w:t>chore(site)</w:t>
+            </w:r>
+          </w:p>
+        </w:tc>
+        <w:tc>
+          <w:tcPr>
+            <w:tcW w:w="0" w:type="auto"/>
+            <w:tcBorders>
+              <w:top w:val="single" w:sz="6" w:space="0" w:color="2A2B2C"/>
+              <w:left w:val="single" w:sz="6" w:space="0" w:color="2A2B2C"/>
+              <w:bottom w:val="single" w:sz="6" w:space="0" w:color="2A2B2C"/>
+              <w:right w:val="single" w:sz="6" w:space="0" w:color="2A2B2C"/>
+            </w:tcBorders>
+            <w:tcMar>
+              <w:top w:w="30" w:type="dxa"/>
+              <w:left w:w="30" w:type="dxa"/>
+              <w:bottom w:w="30" w:type="dxa"/>
+              <w:right w:w="30" w:type="dxa"/>
+            </w:tcMar>
+            <w:vAlign w:val="center"/>
+            <w:hideMark/>
+          </w:tcPr>
+          <w:p>
+            <w:r>
+              <w:t>the 2026-07-05 flat-site backup + reset media images</w:t>
+            </w:r>
+          </w:p>
+        </w:tc>
+      </w:tr>
+      <w:tr>
+        <w:tc>
+          <w:tcPr>
+            <w:tcW w:w="0" w:type="auto"/>
+            <w:tcBorders>
+              <w:top w:val="single" w:sz="6" w:space="0" w:color="2A2B2C"/>
+              <w:left w:val="single" w:sz="6" w:space="0" w:color="2A2B2C"/>
+              <w:bottom w:val="single" w:sz="6" w:space="0" w:color="2A2B2C"/>
+              <w:right w:val="single" w:sz="6" w:space="0" w:color="2A2B2C"/>
+            </w:tcBorders>
+            <w:tcMar>
+              <w:top w:w="30" w:type="dxa"/>
+              <w:left w:w="30" w:type="dxa"/>
+              <w:bottom w:w="30" w:type="dxa"/>
+              <w:right w:w="30" w:type="dxa"/>
+            </w:tcMar>
+            <w:vAlign w:val="center"/>
+            <w:hideMark/>
+          </w:tcPr>
+          <w:p>
+            <w:r>
+              <w:t>chore(brain)</w:t>
+            </w:r>
+          </w:p>
+        </w:tc>
+        <w:tc>
+          <w:tcPr>
+            <w:tcW w:w="0" w:type="auto"/>
+            <w:tcBorders>
+              <w:top w:val="single" w:sz="6" w:space="0" w:color="2A2B2C"/>
+              <w:left w:val="single" w:sz="6" w:space="0" w:color="2A2B2C"/>
+              <w:bottom w:val="single" w:sz="6" w:space="0" w:color="2A2B2C"/>
+              <w:right w:val="single" w:sz="6" w:space="0" w:color="2A2B2C"/>
+            </w:tcBorders>
+            <w:tcMar>
+              <w:top w:w="30" w:type="dxa"/>
+              <w:left w:w="30" w:type="dxa"/>
+              <w:bottom w:w="30" w:type="dxa"/>
+              <w:right w:w="30" w:type="dxa"/>
+            </w:tcMar>
+            <w:vAlign w:val="center"/>
+            <w:hideMark/>
+          </w:tcPr>
+          <w:p>
+            <w:r>
+              <w:t>context brief, tasks, and the tightened .gitignore</w:t>
+            </w:r>
+          </w:p>
+        </w:tc>
+      </w:tr>
+    </w:tbl>
+    <w:p>
+      <w:r>
+        <w:t>Notes from along the way:</w:t>
+      </w:r>
+    </w:p>
+    <w:p>
+      <w:pPr>
+        <w:numPr>
+          <w:ilvl w:val="0"/>
+          <w:numId w:val="25"/>
+        </w:numPr>
+      </w:pPr>
+      <w:r>
+        <w:rPr>
+          <w:b/>
+          <w:bCs/>
+        </w:rPr>
+        <w:lastRenderedPageBreak/>
+        <w:t>Secrets are safe</w:t>
+      </w:r>
+      <w:r>
+        <w:t>: before staging I swept the tree for API keys, tokens, and passwords — the only matches were a form placeholder and a privacy-policy sentence — and confirmed all three 07_Deploy/targets/*/config.json credential files (WordPress, Telegram, prod FTP) are caught by the gitignore rule.</w:t>
+      </w:r>
+    </w:p>
+    <w:p>
+      <w:pPr>
+        <w:numPr>
+          <w:ilvl w:val="0"/>
+          <w:numId w:val="25"/>
+        </w:numPr>
+      </w:pPr>
+      <w:r>
+        <w:rPr>
+          <w:b/>
+          <w:bCs/>
+        </w:rPr>
+        <w:t>The push initially failed</w:t>
+      </w:r>
+      <w:r>
+        <w:t> with an SSL "unable to get local issuer certificate" error — a common Windows git quirk where OpenSSL can't find a CA bundle. I set http.sslBackend schannel for this repo (uses Windows' own certificate store; verification stays fully on) and the push went through. If you see the same error in your other repos, git config --global http.sslBackend schannel fixes it everywhere.</w:t>
+      </w:r>
+    </w:p>
+    <w:p>
+      <w:r>
+        <w:t>The working tree is clean. The plugin now has a proper checkpoint, so you're clear to start the live install — upload, activate, keys, webhook, topics, Run Now.</w:t>
       </w:r>
     </w:p>
     <w:p/>
@@ -7222,6 +9167,268 @@
 <file path=word/numbering.xml><?xml version="1.0" encoding="utf-8"?>
 <w:numbering xmlns:wpc="http://schemas.microsoft.com/office/word/2010/wordprocessingCanvas" xmlns:cx="http://schemas.microsoft.com/office/drawing/2014/chartex" xmlns:cx1="http://schemas.microsoft.com/office/drawing/2015/9/8/chartex" xmlns:cx2="http://schemas.microsoft.com/office/drawing/2015/10/21/chartex" xmlns:cx3="http://schemas.microsoft.com/office/drawing/2016/5/9/chartex" xmlns:cx4="http://schemas.microsoft.com/office/drawing/2016/5/10/chartex" xmlns:cx5="http://schemas.microsoft.com/office/drawing/2016/5/11/chartex" xmlns:cx6="http://schemas.microsoft.com/office/drawing/2016/5/12/chartex" xmlns:cx7="http://schemas.microsoft.com/office/drawing/2016/5/13/chartex" xmlns:cx8="http://schemas.microsoft.com/office/drawing/2016/5/14/chartex" xmlns:mc="http://schemas.openxmlformats.org/markup-compatibility/2006" xmlns:aink="http://schemas.microsoft.com/office/drawing/2016/ink" xmlns:am3d="http://schemas.microsoft.com/office/drawing/2017/model3d" xmlns:o="urn:schemas-microsoft-com:office:office" xmlns:oel="http://schemas.microsoft.com/office/2019/extlst" xmlns:r="http://schemas.openxmlformats.org/officeDocument/2006/relationships" xmlns:m="http://schemas.openxmlformats.org/officeDocument/2006/math" xmlns:v="urn:schemas-microsoft-com:vml" xmlns:wp14="http://schemas.microsoft.com/office/word/2010/wordprocessingDrawing" xmlns:wp="http://schemas.openxmlformats.org/drawingml/2006/wordprocessingDrawing" xmlns:w10="urn:schemas-microsoft-com:office:word" xmlns:w="http://schemas.openxmlformats.org/wordprocessingml/2006/main" xmlns:w14="http://schemas.microsoft.com/office/word/2010/wordml" xmlns:w15="http://schemas.microsoft.com/office/word/2012/wordml" xmlns:w16cex="http://schemas.microsoft.com/office/word/2018/wordml/cex" xmlns:w16cid="http://schemas.microsoft.com/office/word/2016/wordml/cid" xmlns:w16="http://schemas.microsoft.com/office/word/2018/wordml" xmlns:w16du="http://schemas.microsoft.com/office/word/2023/wordml/word16du" xmlns:w16sdtdh="http://schemas.microsoft.com/office/word/2020/wordml/sdtdatahash" xmlns:w16sdtfl="http://schemas.microsoft.com/office/word/2024/wordml/sdtformatlock" xmlns:w16se="http://schemas.microsoft.com/office/word/2015/wordml/symex" xmlns:wpg="http://schemas.microsoft.com/office/word/2010/wordprocessingGroup" xmlns:wpi="http://schemas.microsoft.com/office/word/2010/wordprocessingInk" xmlns:wne="http://schemas.microsoft.com/office/word/2006/wordml" xmlns:wps="http://schemas.microsoft.com/office/word/2010/wordprocessingShape" mc:Ignorable="w14 w15 w16se w16cid w16 w16cex w16sdtdh w16sdtfl w16du wp14">
   <w:abstractNum w:abstractNumId="0" w15:restartNumberingAfterBreak="0">
+    <w:nsid w:val="062C06FA"/>
+    <w:multiLevelType w:val="multilevel"/>
+    <w:tmpl w:val="BD2A81B4"/>
+    <w:lvl w:ilvl="0">
+      <w:start w:val="1"/>
+      <w:numFmt w:val="decimal"/>
+      <w:lvlText w:val="%1."/>
+      <w:lvlJc w:val="left"/>
+      <w:pPr>
+        <w:tabs>
+          <w:tab w:val="num" w:pos="720"/>
+        </w:tabs>
+        <w:ind w:left="720" w:hanging="360"/>
+      </w:pPr>
+    </w:lvl>
+    <w:lvl w:ilvl="1" w:tentative="1">
+      <w:start w:val="1"/>
+      <w:numFmt w:val="decimal"/>
+      <w:lvlText w:val="%2."/>
+      <w:lvlJc w:val="left"/>
+      <w:pPr>
+        <w:tabs>
+          <w:tab w:val="num" w:pos="1440"/>
+        </w:tabs>
+        <w:ind w:left="1440" w:hanging="360"/>
+      </w:pPr>
+    </w:lvl>
+    <w:lvl w:ilvl="2" w:tentative="1">
+      <w:start w:val="1"/>
+      <w:numFmt w:val="decimal"/>
+      <w:lvlText w:val="%3."/>
+      <w:lvlJc w:val="left"/>
+      <w:pPr>
+        <w:tabs>
+          <w:tab w:val="num" w:pos="2160"/>
+        </w:tabs>
+        <w:ind w:left="2160" w:hanging="360"/>
+      </w:pPr>
+    </w:lvl>
+    <w:lvl w:ilvl="3" w:tentative="1">
+      <w:start w:val="1"/>
+      <w:numFmt w:val="decimal"/>
+      <w:lvlText w:val="%4."/>
+      <w:lvlJc w:val="left"/>
+      <w:pPr>
+        <w:tabs>
+          <w:tab w:val="num" w:pos="2880"/>
+        </w:tabs>
+        <w:ind w:left="2880" w:hanging="360"/>
+      </w:pPr>
+    </w:lvl>
+    <w:lvl w:ilvl="4" w:tentative="1">
+      <w:start w:val="1"/>
+      <w:numFmt w:val="decimal"/>
+      <w:lvlText w:val="%5."/>
+      <w:lvlJc w:val="left"/>
+      <w:pPr>
+        <w:tabs>
+          <w:tab w:val="num" w:pos="3600"/>
+        </w:tabs>
+        <w:ind w:left="3600" w:hanging="360"/>
+      </w:pPr>
+    </w:lvl>
+    <w:lvl w:ilvl="5" w:tentative="1">
+      <w:start w:val="1"/>
+      <w:numFmt w:val="decimal"/>
+      <w:lvlText w:val="%6."/>
+      <w:lvlJc w:val="left"/>
+      <w:pPr>
+        <w:tabs>
+          <w:tab w:val="num" w:pos="4320"/>
+        </w:tabs>
+        <w:ind w:left="4320" w:hanging="360"/>
+      </w:pPr>
+    </w:lvl>
+    <w:lvl w:ilvl="6" w:tentative="1">
+      <w:start w:val="1"/>
+      <w:numFmt w:val="decimal"/>
+      <w:lvlText w:val="%7."/>
+      <w:lvlJc w:val="left"/>
+      <w:pPr>
+        <w:tabs>
+          <w:tab w:val="num" w:pos="5040"/>
+        </w:tabs>
+        <w:ind w:left="5040" w:hanging="360"/>
+      </w:pPr>
+    </w:lvl>
+    <w:lvl w:ilvl="7" w:tentative="1">
+      <w:start w:val="1"/>
+      <w:numFmt w:val="decimal"/>
+      <w:lvlText w:val="%8."/>
+      <w:lvlJc w:val="left"/>
+      <w:pPr>
+        <w:tabs>
+          <w:tab w:val="num" w:pos="5760"/>
+        </w:tabs>
+        <w:ind w:left="5760" w:hanging="360"/>
+      </w:pPr>
+    </w:lvl>
+    <w:lvl w:ilvl="8" w:tentative="1">
+      <w:start w:val="1"/>
+      <w:numFmt w:val="decimal"/>
+      <w:lvlText w:val="%9."/>
+      <w:lvlJc w:val="left"/>
+      <w:pPr>
+        <w:tabs>
+          <w:tab w:val="num" w:pos="6480"/>
+        </w:tabs>
+        <w:ind w:left="6480" w:hanging="360"/>
+      </w:pPr>
+    </w:lvl>
+  </w:abstractNum>
+  <w:abstractNum w:abstractNumId="1" w15:restartNumberingAfterBreak="0">
+    <w:nsid w:val="102F0565"/>
+    <w:multiLevelType w:val="multilevel"/>
+    <w:tmpl w:val="46D24DA8"/>
+    <w:lvl w:ilvl="0">
+      <w:start w:val="1"/>
+      <w:numFmt w:val="bullet"/>
+      <w:lvlText w:val=""/>
+      <w:lvlJc w:val="left"/>
+      <w:pPr>
+        <w:tabs>
+          <w:tab w:val="num" w:pos="720"/>
+        </w:tabs>
+        <w:ind w:left="720" w:hanging="360"/>
+      </w:pPr>
+      <w:rPr>
+        <w:rFonts w:ascii="Symbol" w:hAnsi="Symbol" w:hint="default"/>
+        <w:sz w:val="20"/>
+      </w:rPr>
+    </w:lvl>
+    <w:lvl w:ilvl="1" w:tentative="1">
+      <w:start w:val="1"/>
+      <w:numFmt w:val="bullet"/>
+      <w:lvlText w:val="o"/>
+      <w:lvlJc w:val="left"/>
+      <w:pPr>
+        <w:tabs>
+          <w:tab w:val="num" w:pos="1440"/>
+        </w:tabs>
+        <w:ind w:left="1440" w:hanging="360"/>
+      </w:pPr>
+      <w:rPr>
+        <w:rFonts w:ascii="Courier New" w:hAnsi="Courier New" w:hint="default"/>
+        <w:sz w:val="20"/>
+      </w:rPr>
+    </w:lvl>
+    <w:lvl w:ilvl="2" w:tentative="1">
+      <w:start w:val="1"/>
+      <w:numFmt w:val="bullet"/>
+      <w:lvlText w:val=""/>
+      <w:lvlJc w:val="left"/>
+      <w:pPr>
+        <w:tabs>
+          <w:tab w:val="num" w:pos="2160"/>
+        </w:tabs>
+        <w:ind w:left="2160" w:hanging="360"/>
+      </w:pPr>
+      <w:rPr>
+        <w:rFonts w:ascii="Wingdings" w:hAnsi="Wingdings" w:hint="default"/>
+        <w:sz w:val="20"/>
+      </w:rPr>
+    </w:lvl>
+    <w:lvl w:ilvl="3" w:tentative="1">
+      <w:start w:val="1"/>
+      <w:numFmt w:val="bullet"/>
+      <w:lvlText w:val=""/>
+      <w:lvlJc w:val="left"/>
+      <w:pPr>
+        <w:tabs>
+          <w:tab w:val="num" w:pos="2880"/>
+        </w:tabs>
+        <w:ind w:left="2880" w:hanging="360"/>
+      </w:pPr>
+      <w:rPr>
+        <w:rFonts w:ascii="Wingdings" w:hAnsi="Wingdings" w:hint="default"/>
+        <w:sz w:val="20"/>
+      </w:rPr>
+    </w:lvl>
+    <w:lvl w:ilvl="4" w:tentative="1">
+      <w:start w:val="1"/>
+      <w:numFmt w:val="bullet"/>
+      <w:lvlText w:val=""/>
+      <w:lvlJc w:val="left"/>
+      <w:pPr>
+        <w:tabs>
+          <w:tab w:val="num" w:pos="3600"/>
+        </w:tabs>
+        <w:ind w:left="3600" w:hanging="360"/>
+      </w:pPr>
+      <w:rPr>
+        <w:rFonts w:ascii="Wingdings" w:hAnsi="Wingdings" w:hint="default"/>
+        <w:sz w:val="20"/>
+      </w:rPr>
+    </w:lvl>
+    <w:lvl w:ilvl="5" w:tentative="1">
+      <w:start w:val="1"/>
+      <w:numFmt w:val="bullet"/>
+      <w:lvlText w:val=""/>
+      <w:lvlJc w:val="left"/>
+      <w:pPr>
+        <w:tabs>
+          <w:tab w:val="num" w:pos="4320"/>
+        </w:tabs>
+        <w:ind w:left="4320" w:hanging="360"/>
+      </w:pPr>
+      <w:rPr>
+        <w:rFonts w:ascii="Wingdings" w:hAnsi="Wingdings" w:hint="default"/>
+        <w:sz w:val="20"/>
+      </w:rPr>
+    </w:lvl>
+    <w:lvl w:ilvl="6" w:tentative="1">
+      <w:start w:val="1"/>
+      <w:numFmt w:val="bullet"/>
+      <w:lvlText w:val=""/>
+      <w:lvlJc w:val="left"/>
+      <w:pPr>
+        <w:tabs>
+          <w:tab w:val="num" w:pos="5040"/>
+        </w:tabs>
+        <w:ind w:left="5040" w:hanging="360"/>
+      </w:pPr>
+      <w:rPr>
+        <w:rFonts w:ascii="Wingdings" w:hAnsi="Wingdings" w:hint="default"/>
+        <w:sz w:val="20"/>
+      </w:rPr>
+    </w:lvl>
+    <w:lvl w:ilvl="7" w:tentative="1">
+      <w:start w:val="1"/>
+      <w:numFmt w:val="bullet"/>
+      <w:lvlText w:val=""/>
+      <w:lvlJc w:val="left"/>
+      <w:pPr>
+        <w:tabs>
+          <w:tab w:val="num" w:pos="5760"/>
+        </w:tabs>
+        <w:ind w:left="5760" w:hanging="360"/>
+      </w:pPr>
+      <w:rPr>
+        <w:rFonts w:ascii="Wingdings" w:hAnsi="Wingdings" w:hint="default"/>
+        <w:sz w:val="20"/>
+      </w:rPr>
+    </w:lvl>
+    <w:lvl w:ilvl="8" w:tentative="1">
+      <w:start w:val="1"/>
+      <w:numFmt w:val="bullet"/>
+      <w:lvlText w:val=""/>
+      <w:lvlJc w:val="left"/>
+      <w:pPr>
+        <w:tabs>
+          <w:tab w:val="num" w:pos="6480"/>
+        </w:tabs>
+        <w:ind w:left="6480" w:hanging="360"/>
+      </w:pPr>
+      <w:rPr>
+        <w:rFonts w:ascii="Wingdings" w:hAnsi="Wingdings" w:hint="default"/>
+        <w:sz w:val="20"/>
+      </w:rPr>
+    </w:lvl>
+  </w:abstractNum>
+  <w:abstractNum w:abstractNumId="2" w15:restartNumberingAfterBreak="0">
     <w:nsid w:val="13A14616"/>
     <w:multiLevelType w:val="multilevel"/>
     <w:tmpl w:val="DF545E22"/>
@@ -7334,7 +9541,305 @@
       </w:pPr>
     </w:lvl>
   </w:abstractNum>
-  <w:abstractNum w:abstractNumId="1" w15:restartNumberingAfterBreak="0">
+  <w:abstractNum w:abstractNumId="3" w15:restartNumberingAfterBreak="0">
+    <w:nsid w:val="179571E1"/>
+    <w:multiLevelType w:val="multilevel"/>
+    <w:tmpl w:val="07DE4E56"/>
+    <w:lvl w:ilvl="0">
+      <w:start w:val="1"/>
+      <w:numFmt w:val="bullet"/>
+      <w:lvlText w:val=""/>
+      <w:lvlJc w:val="left"/>
+      <w:pPr>
+        <w:tabs>
+          <w:tab w:val="num" w:pos="720"/>
+        </w:tabs>
+        <w:ind w:left="720" w:hanging="360"/>
+      </w:pPr>
+      <w:rPr>
+        <w:rFonts w:ascii="Symbol" w:hAnsi="Symbol" w:hint="default"/>
+        <w:sz w:val="20"/>
+      </w:rPr>
+    </w:lvl>
+    <w:lvl w:ilvl="1" w:tentative="1">
+      <w:start w:val="1"/>
+      <w:numFmt w:val="bullet"/>
+      <w:lvlText w:val="o"/>
+      <w:lvlJc w:val="left"/>
+      <w:pPr>
+        <w:tabs>
+          <w:tab w:val="num" w:pos="1440"/>
+        </w:tabs>
+        <w:ind w:left="1440" w:hanging="360"/>
+      </w:pPr>
+      <w:rPr>
+        <w:rFonts w:ascii="Courier New" w:hAnsi="Courier New" w:hint="default"/>
+        <w:sz w:val="20"/>
+      </w:rPr>
+    </w:lvl>
+    <w:lvl w:ilvl="2" w:tentative="1">
+      <w:start w:val="1"/>
+      <w:numFmt w:val="bullet"/>
+      <w:lvlText w:val=""/>
+      <w:lvlJc w:val="left"/>
+      <w:pPr>
+        <w:tabs>
+          <w:tab w:val="num" w:pos="2160"/>
+        </w:tabs>
+        <w:ind w:left="2160" w:hanging="360"/>
+      </w:pPr>
+      <w:rPr>
+        <w:rFonts w:ascii="Wingdings" w:hAnsi="Wingdings" w:hint="default"/>
+        <w:sz w:val="20"/>
+      </w:rPr>
+    </w:lvl>
+    <w:lvl w:ilvl="3" w:tentative="1">
+      <w:start w:val="1"/>
+      <w:numFmt w:val="bullet"/>
+      <w:lvlText w:val=""/>
+      <w:lvlJc w:val="left"/>
+      <w:pPr>
+        <w:tabs>
+          <w:tab w:val="num" w:pos="2880"/>
+        </w:tabs>
+        <w:ind w:left="2880" w:hanging="360"/>
+      </w:pPr>
+      <w:rPr>
+        <w:rFonts w:ascii="Wingdings" w:hAnsi="Wingdings" w:hint="default"/>
+        <w:sz w:val="20"/>
+      </w:rPr>
+    </w:lvl>
+    <w:lvl w:ilvl="4" w:tentative="1">
+      <w:start w:val="1"/>
+      <w:numFmt w:val="bullet"/>
+      <w:lvlText w:val=""/>
+      <w:lvlJc w:val="left"/>
+      <w:pPr>
+        <w:tabs>
+          <w:tab w:val="num" w:pos="3600"/>
+        </w:tabs>
+        <w:ind w:left="3600" w:hanging="360"/>
+      </w:pPr>
+      <w:rPr>
+        <w:rFonts w:ascii="Wingdings" w:hAnsi="Wingdings" w:hint="default"/>
+        <w:sz w:val="20"/>
+      </w:rPr>
+    </w:lvl>
+    <w:lvl w:ilvl="5" w:tentative="1">
+      <w:start w:val="1"/>
+      <w:numFmt w:val="bullet"/>
+      <w:lvlText w:val=""/>
+      <w:lvlJc w:val="left"/>
+      <w:pPr>
+        <w:tabs>
+          <w:tab w:val="num" w:pos="4320"/>
+        </w:tabs>
+        <w:ind w:left="4320" w:hanging="360"/>
+      </w:pPr>
+      <w:rPr>
+        <w:rFonts w:ascii="Wingdings" w:hAnsi="Wingdings" w:hint="default"/>
+        <w:sz w:val="20"/>
+      </w:rPr>
+    </w:lvl>
+    <w:lvl w:ilvl="6" w:tentative="1">
+      <w:start w:val="1"/>
+      <w:numFmt w:val="bullet"/>
+      <w:lvlText w:val=""/>
+      <w:lvlJc w:val="left"/>
+      <w:pPr>
+        <w:tabs>
+          <w:tab w:val="num" w:pos="5040"/>
+        </w:tabs>
+        <w:ind w:left="5040" w:hanging="360"/>
+      </w:pPr>
+      <w:rPr>
+        <w:rFonts w:ascii="Wingdings" w:hAnsi="Wingdings" w:hint="default"/>
+        <w:sz w:val="20"/>
+      </w:rPr>
+    </w:lvl>
+    <w:lvl w:ilvl="7" w:tentative="1">
+      <w:start w:val="1"/>
+      <w:numFmt w:val="bullet"/>
+      <w:lvlText w:val=""/>
+      <w:lvlJc w:val="left"/>
+      <w:pPr>
+        <w:tabs>
+          <w:tab w:val="num" w:pos="5760"/>
+        </w:tabs>
+        <w:ind w:left="5760" w:hanging="360"/>
+      </w:pPr>
+      <w:rPr>
+        <w:rFonts w:ascii="Wingdings" w:hAnsi="Wingdings" w:hint="default"/>
+        <w:sz w:val="20"/>
+      </w:rPr>
+    </w:lvl>
+    <w:lvl w:ilvl="8" w:tentative="1">
+      <w:start w:val="1"/>
+      <w:numFmt w:val="bullet"/>
+      <w:lvlText w:val=""/>
+      <w:lvlJc w:val="left"/>
+      <w:pPr>
+        <w:tabs>
+          <w:tab w:val="num" w:pos="6480"/>
+        </w:tabs>
+        <w:ind w:left="6480" w:hanging="360"/>
+      </w:pPr>
+      <w:rPr>
+        <w:rFonts w:ascii="Wingdings" w:hAnsi="Wingdings" w:hint="default"/>
+        <w:sz w:val="20"/>
+      </w:rPr>
+    </w:lvl>
+  </w:abstractNum>
+  <w:abstractNum w:abstractNumId="4" w15:restartNumberingAfterBreak="0">
+    <w:nsid w:val="22DB6D60"/>
+    <w:multiLevelType w:val="multilevel"/>
+    <w:tmpl w:val="87822178"/>
+    <w:lvl w:ilvl="0">
+      <w:start w:val="1"/>
+      <w:numFmt w:val="bullet"/>
+      <w:lvlText w:val=""/>
+      <w:lvlJc w:val="left"/>
+      <w:pPr>
+        <w:tabs>
+          <w:tab w:val="num" w:pos="720"/>
+        </w:tabs>
+        <w:ind w:left="720" w:hanging="360"/>
+      </w:pPr>
+      <w:rPr>
+        <w:rFonts w:ascii="Symbol" w:hAnsi="Symbol" w:hint="default"/>
+        <w:sz w:val="20"/>
+      </w:rPr>
+    </w:lvl>
+    <w:lvl w:ilvl="1" w:tentative="1">
+      <w:start w:val="1"/>
+      <w:numFmt w:val="bullet"/>
+      <w:lvlText w:val="o"/>
+      <w:lvlJc w:val="left"/>
+      <w:pPr>
+        <w:tabs>
+          <w:tab w:val="num" w:pos="1440"/>
+        </w:tabs>
+        <w:ind w:left="1440" w:hanging="360"/>
+      </w:pPr>
+      <w:rPr>
+        <w:rFonts w:ascii="Courier New" w:hAnsi="Courier New" w:hint="default"/>
+        <w:sz w:val="20"/>
+      </w:rPr>
+    </w:lvl>
+    <w:lvl w:ilvl="2" w:tentative="1">
+      <w:start w:val="1"/>
+      <w:numFmt w:val="bullet"/>
+      <w:lvlText w:val=""/>
+      <w:lvlJc w:val="left"/>
+      <w:pPr>
+        <w:tabs>
+          <w:tab w:val="num" w:pos="2160"/>
+        </w:tabs>
+        <w:ind w:left="2160" w:hanging="360"/>
+      </w:pPr>
+      <w:rPr>
+        <w:rFonts w:ascii="Wingdings" w:hAnsi="Wingdings" w:hint="default"/>
+        <w:sz w:val="20"/>
+      </w:rPr>
+    </w:lvl>
+    <w:lvl w:ilvl="3" w:tentative="1">
+      <w:start w:val="1"/>
+      <w:numFmt w:val="bullet"/>
+      <w:lvlText w:val=""/>
+      <w:lvlJc w:val="left"/>
+      <w:pPr>
+        <w:tabs>
+          <w:tab w:val="num" w:pos="2880"/>
+        </w:tabs>
+        <w:ind w:left="2880" w:hanging="360"/>
+      </w:pPr>
+      <w:rPr>
+        <w:rFonts w:ascii="Wingdings" w:hAnsi="Wingdings" w:hint="default"/>
+        <w:sz w:val="20"/>
+      </w:rPr>
+    </w:lvl>
+    <w:lvl w:ilvl="4" w:tentative="1">
+      <w:start w:val="1"/>
+      <w:numFmt w:val="bullet"/>
+      <w:lvlText w:val=""/>
+      <w:lvlJc w:val="left"/>
+      <w:pPr>
+        <w:tabs>
+          <w:tab w:val="num" w:pos="3600"/>
+        </w:tabs>
+        <w:ind w:left="3600" w:hanging="360"/>
+      </w:pPr>
+      <w:rPr>
+        <w:rFonts w:ascii="Wingdings" w:hAnsi="Wingdings" w:hint="default"/>
+        <w:sz w:val="20"/>
+      </w:rPr>
+    </w:lvl>
+    <w:lvl w:ilvl="5" w:tentative="1">
+      <w:start w:val="1"/>
+      <w:numFmt w:val="bullet"/>
+      <w:lvlText w:val=""/>
+      <w:lvlJc w:val="left"/>
+      <w:pPr>
+        <w:tabs>
+          <w:tab w:val="num" w:pos="4320"/>
+        </w:tabs>
+        <w:ind w:left="4320" w:hanging="360"/>
+      </w:pPr>
+      <w:rPr>
+        <w:rFonts w:ascii="Wingdings" w:hAnsi="Wingdings" w:hint="default"/>
+        <w:sz w:val="20"/>
+      </w:rPr>
+    </w:lvl>
+    <w:lvl w:ilvl="6" w:tentative="1">
+      <w:start w:val="1"/>
+      <w:numFmt w:val="bullet"/>
+      <w:lvlText w:val=""/>
+      <w:lvlJc w:val="left"/>
+      <w:pPr>
+        <w:tabs>
+          <w:tab w:val="num" w:pos="5040"/>
+        </w:tabs>
+        <w:ind w:left="5040" w:hanging="360"/>
+      </w:pPr>
+      <w:rPr>
+        <w:rFonts w:ascii="Wingdings" w:hAnsi="Wingdings" w:hint="default"/>
+        <w:sz w:val="20"/>
+      </w:rPr>
+    </w:lvl>
+    <w:lvl w:ilvl="7" w:tentative="1">
+      <w:start w:val="1"/>
+      <w:numFmt w:val="bullet"/>
+      <w:lvlText w:val=""/>
+      <w:lvlJc w:val="left"/>
+      <w:pPr>
+        <w:tabs>
+          <w:tab w:val="num" w:pos="5760"/>
+        </w:tabs>
+        <w:ind w:left="5760" w:hanging="360"/>
+      </w:pPr>
+      <w:rPr>
+        <w:rFonts w:ascii="Wingdings" w:hAnsi="Wingdings" w:hint="default"/>
+        <w:sz w:val="20"/>
+      </w:rPr>
+    </w:lvl>
+    <w:lvl w:ilvl="8" w:tentative="1">
+      <w:start w:val="1"/>
+      <w:numFmt w:val="bullet"/>
+      <w:lvlText w:val=""/>
+      <w:lvlJc w:val="left"/>
+      <w:pPr>
+        <w:tabs>
+          <w:tab w:val="num" w:pos="6480"/>
+        </w:tabs>
+        <w:ind w:left="6480" w:hanging="360"/>
+      </w:pPr>
+      <w:rPr>
+        <w:rFonts w:ascii="Wingdings" w:hAnsi="Wingdings" w:hint="default"/>
+        <w:sz w:val="20"/>
+      </w:rPr>
+    </w:lvl>
+  </w:abstractNum>
+  <w:abstractNum w:abstractNumId="5" w15:restartNumberingAfterBreak="0">
     <w:nsid w:val="22F704FD"/>
     <w:multiLevelType w:val="multilevel"/>
     <w:tmpl w:val="2ABE4574"/>
@@ -7447,7 +9952,7 @@
       </w:pPr>
     </w:lvl>
   </w:abstractNum>
-  <w:abstractNum w:abstractNumId="2" w15:restartNumberingAfterBreak="0">
+  <w:abstractNum w:abstractNumId="6" w15:restartNumberingAfterBreak="0">
     <w:nsid w:val="287B42EC"/>
     <w:multiLevelType w:val="multilevel"/>
     <w:tmpl w:val="354AC490"/>
@@ -7596,7 +10101,7 @@
       </w:rPr>
     </w:lvl>
   </w:abstractNum>
-  <w:abstractNum w:abstractNumId="3" w15:restartNumberingAfterBreak="0">
+  <w:abstractNum w:abstractNumId="7" w15:restartNumberingAfterBreak="0">
     <w:nsid w:val="2970596A"/>
     <w:multiLevelType w:val="multilevel"/>
     <w:tmpl w:val="E4B825BC"/>
@@ -7745,7 +10250,233 @@
       </w:rPr>
     </w:lvl>
   </w:abstractNum>
-  <w:abstractNum w:abstractNumId="4" w15:restartNumberingAfterBreak="0">
+  <w:abstractNum w:abstractNumId="8" w15:restartNumberingAfterBreak="0">
+    <w:nsid w:val="29E144F5"/>
+    <w:multiLevelType w:val="multilevel"/>
+    <w:tmpl w:val="458694A0"/>
+    <w:lvl w:ilvl="0">
+      <w:start w:val="1"/>
+      <w:numFmt w:val="decimal"/>
+      <w:lvlText w:val="%1."/>
+      <w:lvlJc w:val="left"/>
+      <w:pPr>
+        <w:tabs>
+          <w:tab w:val="num" w:pos="720"/>
+        </w:tabs>
+        <w:ind w:left="720" w:hanging="360"/>
+      </w:pPr>
+    </w:lvl>
+    <w:lvl w:ilvl="1" w:tentative="1">
+      <w:start w:val="1"/>
+      <w:numFmt w:val="decimal"/>
+      <w:lvlText w:val="%2."/>
+      <w:lvlJc w:val="left"/>
+      <w:pPr>
+        <w:tabs>
+          <w:tab w:val="num" w:pos="1440"/>
+        </w:tabs>
+        <w:ind w:left="1440" w:hanging="360"/>
+      </w:pPr>
+    </w:lvl>
+    <w:lvl w:ilvl="2" w:tentative="1">
+      <w:start w:val="1"/>
+      <w:numFmt w:val="decimal"/>
+      <w:lvlText w:val="%3."/>
+      <w:lvlJc w:val="left"/>
+      <w:pPr>
+        <w:tabs>
+          <w:tab w:val="num" w:pos="2160"/>
+        </w:tabs>
+        <w:ind w:left="2160" w:hanging="360"/>
+      </w:pPr>
+    </w:lvl>
+    <w:lvl w:ilvl="3" w:tentative="1">
+      <w:start w:val="1"/>
+      <w:numFmt w:val="decimal"/>
+      <w:lvlText w:val="%4."/>
+      <w:lvlJc w:val="left"/>
+      <w:pPr>
+        <w:tabs>
+          <w:tab w:val="num" w:pos="2880"/>
+        </w:tabs>
+        <w:ind w:left="2880" w:hanging="360"/>
+      </w:pPr>
+    </w:lvl>
+    <w:lvl w:ilvl="4" w:tentative="1">
+      <w:start w:val="1"/>
+      <w:numFmt w:val="decimal"/>
+      <w:lvlText w:val="%5."/>
+      <w:lvlJc w:val="left"/>
+      <w:pPr>
+        <w:tabs>
+          <w:tab w:val="num" w:pos="3600"/>
+        </w:tabs>
+        <w:ind w:left="3600" w:hanging="360"/>
+      </w:pPr>
+    </w:lvl>
+    <w:lvl w:ilvl="5" w:tentative="1">
+      <w:start w:val="1"/>
+      <w:numFmt w:val="decimal"/>
+      <w:lvlText w:val="%6."/>
+      <w:lvlJc w:val="left"/>
+      <w:pPr>
+        <w:tabs>
+          <w:tab w:val="num" w:pos="4320"/>
+        </w:tabs>
+        <w:ind w:left="4320" w:hanging="360"/>
+      </w:pPr>
+    </w:lvl>
+    <w:lvl w:ilvl="6" w:tentative="1">
+      <w:start w:val="1"/>
+      <w:numFmt w:val="decimal"/>
+      <w:lvlText w:val="%7."/>
+      <w:lvlJc w:val="left"/>
+      <w:pPr>
+        <w:tabs>
+          <w:tab w:val="num" w:pos="5040"/>
+        </w:tabs>
+        <w:ind w:left="5040" w:hanging="360"/>
+      </w:pPr>
+    </w:lvl>
+    <w:lvl w:ilvl="7" w:tentative="1">
+      <w:start w:val="1"/>
+      <w:numFmt w:val="decimal"/>
+      <w:lvlText w:val="%8."/>
+      <w:lvlJc w:val="left"/>
+      <w:pPr>
+        <w:tabs>
+          <w:tab w:val="num" w:pos="5760"/>
+        </w:tabs>
+        <w:ind w:left="5760" w:hanging="360"/>
+      </w:pPr>
+    </w:lvl>
+    <w:lvl w:ilvl="8" w:tentative="1">
+      <w:start w:val="1"/>
+      <w:numFmt w:val="decimal"/>
+      <w:lvlText w:val="%9."/>
+      <w:lvlJc w:val="left"/>
+      <w:pPr>
+        <w:tabs>
+          <w:tab w:val="num" w:pos="6480"/>
+        </w:tabs>
+        <w:ind w:left="6480" w:hanging="360"/>
+      </w:pPr>
+    </w:lvl>
+  </w:abstractNum>
+  <w:abstractNum w:abstractNumId="9" w15:restartNumberingAfterBreak="0">
+    <w:nsid w:val="31373CC7"/>
+    <w:multiLevelType w:val="multilevel"/>
+    <w:tmpl w:val="A9A00800"/>
+    <w:lvl w:ilvl="0">
+      <w:start w:val="1"/>
+      <w:numFmt w:val="decimal"/>
+      <w:lvlText w:val="%1."/>
+      <w:lvlJc w:val="left"/>
+      <w:pPr>
+        <w:tabs>
+          <w:tab w:val="num" w:pos="720"/>
+        </w:tabs>
+        <w:ind w:left="720" w:hanging="360"/>
+      </w:pPr>
+    </w:lvl>
+    <w:lvl w:ilvl="1" w:tentative="1">
+      <w:start w:val="1"/>
+      <w:numFmt w:val="decimal"/>
+      <w:lvlText w:val="%2."/>
+      <w:lvlJc w:val="left"/>
+      <w:pPr>
+        <w:tabs>
+          <w:tab w:val="num" w:pos="1440"/>
+        </w:tabs>
+        <w:ind w:left="1440" w:hanging="360"/>
+      </w:pPr>
+    </w:lvl>
+    <w:lvl w:ilvl="2" w:tentative="1">
+      <w:start w:val="1"/>
+      <w:numFmt w:val="decimal"/>
+      <w:lvlText w:val="%3."/>
+      <w:lvlJc w:val="left"/>
+      <w:pPr>
+        <w:tabs>
+          <w:tab w:val="num" w:pos="2160"/>
+        </w:tabs>
+        <w:ind w:left="2160" w:hanging="360"/>
+      </w:pPr>
+    </w:lvl>
+    <w:lvl w:ilvl="3" w:tentative="1">
+      <w:start w:val="1"/>
+      <w:numFmt w:val="decimal"/>
+      <w:lvlText w:val="%4."/>
+      <w:lvlJc w:val="left"/>
+      <w:pPr>
+        <w:tabs>
+          <w:tab w:val="num" w:pos="2880"/>
+        </w:tabs>
+        <w:ind w:left="2880" w:hanging="360"/>
+      </w:pPr>
+    </w:lvl>
+    <w:lvl w:ilvl="4" w:tentative="1">
+      <w:start w:val="1"/>
+      <w:numFmt w:val="decimal"/>
+      <w:lvlText w:val="%5."/>
+      <w:lvlJc w:val="left"/>
+      <w:pPr>
+        <w:tabs>
+          <w:tab w:val="num" w:pos="3600"/>
+        </w:tabs>
+        <w:ind w:left="3600" w:hanging="360"/>
+      </w:pPr>
+    </w:lvl>
+    <w:lvl w:ilvl="5" w:tentative="1">
+      <w:start w:val="1"/>
+      <w:numFmt w:val="decimal"/>
+      <w:lvlText w:val="%6."/>
+      <w:lvlJc w:val="left"/>
+      <w:pPr>
+        <w:tabs>
+          <w:tab w:val="num" w:pos="4320"/>
+        </w:tabs>
+        <w:ind w:left="4320" w:hanging="360"/>
+      </w:pPr>
+    </w:lvl>
+    <w:lvl w:ilvl="6" w:tentative="1">
+      <w:start w:val="1"/>
+      <w:numFmt w:val="decimal"/>
+      <w:lvlText w:val="%7."/>
+      <w:lvlJc w:val="left"/>
+      <w:pPr>
+        <w:tabs>
+          <w:tab w:val="num" w:pos="5040"/>
+        </w:tabs>
+        <w:ind w:left="5040" w:hanging="360"/>
+      </w:pPr>
+    </w:lvl>
+    <w:lvl w:ilvl="7" w:tentative="1">
+      <w:start w:val="1"/>
+      <w:numFmt w:val="decimal"/>
+      <w:lvlText w:val="%8."/>
+      <w:lvlJc w:val="left"/>
+      <w:pPr>
+        <w:tabs>
+          <w:tab w:val="num" w:pos="5760"/>
+        </w:tabs>
+        <w:ind w:left="5760" w:hanging="360"/>
+      </w:pPr>
+    </w:lvl>
+    <w:lvl w:ilvl="8" w:tentative="1">
+      <w:start w:val="1"/>
+      <w:numFmt w:val="decimal"/>
+      <w:lvlText w:val="%9."/>
+      <w:lvlJc w:val="left"/>
+      <w:pPr>
+        <w:tabs>
+          <w:tab w:val="num" w:pos="6480"/>
+        </w:tabs>
+        <w:ind w:left="6480" w:hanging="360"/>
+      </w:pPr>
+    </w:lvl>
+  </w:abstractNum>
+  <w:abstractNum w:abstractNumId="10" w15:restartNumberingAfterBreak="0">
     <w:nsid w:val="31901333"/>
     <w:multiLevelType w:val="multilevel"/>
     <w:tmpl w:val="815284D6"/>
@@ -7894,7 +10625,7 @@
       </w:rPr>
     </w:lvl>
   </w:abstractNum>
-  <w:abstractNum w:abstractNumId="5" w15:restartNumberingAfterBreak="0">
+  <w:abstractNum w:abstractNumId="11" w15:restartNumberingAfterBreak="0">
     <w:nsid w:val="32B226A2"/>
     <w:multiLevelType w:val="multilevel"/>
     <w:tmpl w:val="B7549AE0"/>
@@ -8043,7 +10774,120 @@
       </w:rPr>
     </w:lvl>
   </w:abstractNum>
-  <w:abstractNum w:abstractNumId="6" w15:restartNumberingAfterBreak="0">
+  <w:abstractNum w:abstractNumId="12" w15:restartNumberingAfterBreak="0">
+    <w:nsid w:val="348E7CA0"/>
+    <w:multiLevelType w:val="multilevel"/>
+    <w:tmpl w:val="C7F21B6C"/>
+    <w:lvl w:ilvl="0">
+      <w:start w:val="1"/>
+      <w:numFmt w:val="decimal"/>
+      <w:lvlText w:val="%1."/>
+      <w:lvlJc w:val="left"/>
+      <w:pPr>
+        <w:tabs>
+          <w:tab w:val="num" w:pos="720"/>
+        </w:tabs>
+        <w:ind w:left="720" w:hanging="360"/>
+      </w:pPr>
+    </w:lvl>
+    <w:lvl w:ilvl="1" w:tentative="1">
+      <w:start w:val="1"/>
+      <w:numFmt w:val="decimal"/>
+      <w:lvlText w:val="%2."/>
+      <w:lvlJc w:val="left"/>
+      <w:pPr>
+        <w:tabs>
+          <w:tab w:val="num" w:pos="1440"/>
+        </w:tabs>
+        <w:ind w:left="1440" w:hanging="360"/>
+      </w:pPr>
+    </w:lvl>
+    <w:lvl w:ilvl="2" w:tentative="1">
+      <w:start w:val="1"/>
+      <w:numFmt w:val="decimal"/>
+      <w:lvlText w:val="%3."/>
+      <w:lvlJc w:val="left"/>
+      <w:pPr>
+        <w:tabs>
+          <w:tab w:val="num" w:pos="2160"/>
+        </w:tabs>
+        <w:ind w:left="2160" w:hanging="360"/>
+      </w:pPr>
+    </w:lvl>
+    <w:lvl w:ilvl="3" w:tentative="1">
+      <w:start w:val="1"/>
+      <w:numFmt w:val="decimal"/>
+      <w:lvlText w:val="%4."/>
+      <w:lvlJc w:val="left"/>
+      <w:pPr>
+        <w:tabs>
+          <w:tab w:val="num" w:pos="2880"/>
+        </w:tabs>
+        <w:ind w:left="2880" w:hanging="360"/>
+      </w:pPr>
+    </w:lvl>
+    <w:lvl w:ilvl="4" w:tentative="1">
+      <w:start w:val="1"/>
+      <w:numFmt w:val="decimal"/>
+      <w:lvlText w:val="%5."/>
+      <w:lvlJc w:val="left"/>
+      <w:pPr>
+        <w:tabs>
+          <w:tab w:val="num" w:pos="3600"/>
+        </w:tabs>
+        <w:ind w:left="3600" w:hanging="360"/>
+      </w:pPr>
+    </w:lvl>
+    <w:lvl w:ilvl="5" w:tentative="1">
+      <w:start w:val="1"/>
+      <w:numFmt w:val="decimal"/>
+      <w:lvlText w:val="%6."/>
+      <w:lvlJc w:val="left"/>
+      <w:pPr>
+        <w:tabs>
+          <w:tab w:val="num" w:pos="4320"/>
+        </w:tabs>
+        <w:ind w:left="4320" w:hanging="360"/>
+      </w:pPr>
+    </w:lvl>
+    <w:lvl w:ilvl="6" w:tentative="1">
+      <w:start w:val="1"/>
+      <w:numFmt w:val="decimal"/>
+      <w:lvlText w:val="%7."/>
+      <w:lvlJc w:val="left"/>
+      <w:pPr>
+        <w:tabs>
+          <w:tab w:val="num" w:pos="5040"/>
+        </w:tabs>
+        <w:ind w:left="5040" w:hanging="360"/>
+      </w:pPr>
+    </w:lvl>
+    <w:lvl w:ilvl="7" w:tentative="1">
+      <w:start w:val="1"/>
+      <w:numFmt w:val="decimal"/>
+      <w:lvlText w:val="%8."/>
+      <w:lvlJc w:val="left"/>
+      <w:pPr>
+        <w:tabs>
+          <w:tab w:val="num" w:pos="5760"/>
+        </w:tabs>
+        <w:ind w:left="5760" w:hanging="360"/>
+      </w:pPr>
+    </w:lvl>
+    <w:lvl w:ilvl="8" w:tentative="1">
+      <w:start w:val="1"/>
+      <w:numFmt w:val="decimal"/>
+      <w:lvlText w:val="%9."/>
+      <w:lvlJc w:val="left"/>
+      <w:pPr>
+        <w:tabs>
+          <w:tab w:val="num" w:pos="6480"/>
+        </w:tabs>
+        <w:ind w:left="6480" w:hanging="360"/>
+      </w:pPr>
+    </w:lvl>
+  </w:abstractNum>
+  <w:abstractNum w:abstractNumId="13" w15:restartNumberingAfterBreak="0">
     <w:nsid w:val="3A2A0C16"/>
     <w:multiLevelType w:val="multilevel"/>
     <w:tmpl w:val="D1A64C30"/>
@@ -8192,7 +11036,7 @@
       </w:rPr>
     </w:lvl>
   </w:abstractNum>
-  <w:abstractNum w:abstractNumId="7" w15:restartNumberingAfterBreak="0">
+  <w:abstractNum w:abstractNumId="14" w15:restartNumberingAfterBreak="0">
     <w:nsid w:val="3FC34F77"/>
     <w:multiLevelType w:val="multilevel"/>
     <w:tmpl w:val="BF4E85AA"/>
@@ -8341,7 +11185,7 @@
       </w:rPr>
     </w:lvl>
   </w:abstractNum>
-  <w:abstractNum w:abstractNumId="8" w15:restartNumberingAfterBreak="0">
+  <w:abstractNum w:abstractNumId="15" w15:restartNumberingAfterBreak="0">
     <w:nsid w:val="4A805B9A"/>
     <w:multiLevelType w:val="multilevel"/>
     <w:tmpl w:val="C2000228"/>
@@ -8454,7 +11298,305 @@
       </w:pPr>
     </w:lvl>
   </w:abstractNum>
-  <w:abstractNum w:abstractNumId="9" w15:restartNumberingAfterBreak="0">
+  <w:abstractNum w:abstractNumId="16" w15:restartNumberingAfterBreak="0">
+    <w:nsid w:val="606A169F"/>
+    <w:multiLevelType w:val="multilevel"/>
+    <w:tmpl w:val="F2ECC708"/>
+    <w:lvl w:ilvl="0">
+      <w:start w:val="1"/>
+      <w:numFmt w:val="bullet"/>
+      <w:lvlText w:val=""/>
+      <w:lvlJc w:val="left"/>
+      <w:pPr>
+        <w:tabs>
+          <w:tab w:val="num" w:pos="720"/>
+        </w:tabs>
+        <w:ind w:left="720" w:hanging="360"/>
+      </w:pPr>
+      <w:rPr>
+        <w:rFonts w:ascii="Symbol" w:hAnsi="Symbol" w:hint="default"/>
+        <w:sz w:val="20"/>
+      </w:rPr>
+    </w:lvl>
+    <w:lvl w:ilvl="1" w:tentative="1">
+      <w:start w:val="1"/>
+      <w:numFmt w:val="bullet"/>
+      <w:lvlText w:val="o"/>
+      <w:lvlJc w:val="left"/>
+      <w:pPr>
+        <w:tabs>
+          <w:tab w:val="num" w:pos="1440"/>
+        </w:tabs>
+        <w:ind w:left="1440" w:hanging="360"/>
+      </w:pPr>
+      <w:rPr>
+        <w:rFonts w:ascii="Courier New" w:hAnsi="Courier New" w:hint="default"/>
+        <w:sz w:val="20"/>
+      </w:rPr>
+    </w:lvl>
+    <w:lvl w:ilvl="2" w:tentative="1">
+      <w:start w:val="1"/>
+      <w:numFmt w:val="bullet"/>
+      <w:lvlText w:val=""/>
+      <w:lvlJc w:val="left"/>
+      <w:pPr>
+        <w:tabs>
+          <w:tab w:val="num" w:pos="2160"/>
+        </w:tabs>
+        <w:ind w:left="2160" w:hanging="360"/>
+      </w:pPr>
+      <w:rPr>
+        <w:rFonts w:ascii="Wingdings" w:hAnsi="Wingdings" w:hint="default"/>
+        <w:sz w:val="20"/>
+      </w:rPr>
+    </w:lvl>
+    <w:lvl w:ilvl="3" w:tentative="1">
+      <w:start w:val="1"/>
+      <w:numFmt w:val="bullet"/>
+      <w:lvlText w:val=""/>
+      <w:lvlJc w:val="left"/>
+      <w:pPr>
+        <w:tabs>
+          <w:tab w:val="num" w:pos="2880"/>
+        </w:tabs>
+        <w:ind w:left="2880" w:hanging="360"/>
+      </w:pPr>
+      <w:rPr>
+        <w:rFonts w:ascii="Wingdings" w:hAnsi="Wingdings" w:hint="default"/>
+        <w:sz w:val="20"/>
+      </w:rPr>
+    </w:lvl>
+    <w:lvl w:ilvl="4" w:tentative="1">
+      <w:start w:val="1"/>
+      <w:numFmt w:val="bullet"/>
+      <w:lvlText w:val=""/>
+      <w:lvlJc w:val="left"/>
+      <w:pPr>
+        <w:tabs>
+          <w:tab w:val="num" w:pos="3600"/>
+        </w:tabs>
+        <w:ind w:left="3600" w:hanging="360"/>
+      </w:pPr>
+      <w:rPr>
+        <w:rFonts w:ascii="Wingdings" w:hAnsi="Wingdings" w:hint="default"/>
+        <w:sz w:val="20"/>
+      </w:rPr>
+    </w:lvl>
+    <w:lvl w:ilvl="5" w:tentative="1">
+      <w:start w:val="1"/>
+      <w:numFmt w:val="bullet"/>
+      <w:lvlText w:val=""/>
+      <w:lvlJc w:val="left"/>
+      <w:pPr>
+        <w:tabs>
+          <w:tab w:val="num" w:pos="4320"/>
+        </w:tabs>
+        <w:ind w:left="4320" w:hanging="360"/>
+      </w:pPr>
+      <w:rPr>
+        <w:rFonts w:ascii="Wingdings" w:hAnsi="Wingdings" w:hint="default"/>
+        <w:sz w:val="20"/>
+      </w:rPr>
+    </w:lvl>
+    <w:lvl w:ilvl="6" w:tentative="1">
+      <w:start w:val="1"/>
+      <w:numFmt w:val="bullet"/>
+      <w:lvlText w:val=""/>
+      <w:lvlJc w:val="left"/>
+      <w:pPr>
+        <w:tabs>
+          <w:tab w:val="num" w:pos="5040"/>
+        </w:tabs>
+        <w:ind w:left="5040" w:hanging="360"/>
+      </w:pPr>
+      <w:rPr>
+        <w:rFonts w:ascii="Wingdings" w:hAnsi="Wingdings" w:hint="default"/>
+        <w:sz w:val="20"/>
+      </w:rPr>
+    </w:lvl>
+    <w:lvl w:ilvl="7" w:tentative="1">
+      <w:start w:val="1"/>
+      <w:numFmt w:val="bullet"/>
+      <w:lvlText w:val=""/>
+      <w:lvlJc w:val="left"/>
+      <w:pPr>
+        <w:tabs>
+          <w:tab w:val="num" w:pos="5760"/>
+        </w:tabs>
+        <w:ind w:left="5760" w:hanging="360"/>
+      </w:pPr>
+      <w:rPr>
+        <w:rFonts w:ascii="Wingdings" w:hAnsi="Wingdings" w:hint="default"/>
+        <w:sz w:val="20"/>
+      </w:rPr>
+    </w:lvl>
+    <w:lvl w:ilvl="8" w:tentative="1">
+      <w:start w:val="1"/>
+      <w:numFmt w:val="bullet"/>
+      <w:lvlText w:val=""/>
+      <w:lvlJc w:val="left"/>
+      <w:pPr>
+        <w:tabs>
+          <w:tab w:val="num" w:pos="6480"/>
+        </w:tabs>
+        <w:ind w:left="6480" w:hanging="360"/>
+      </w:pPr>
+      <w:rPr>
+        <w:rFonts w:ascii="Wingdings" w:hAnsi="Wingdings" w:hint="default"/>
+        <w:sz w:val="20"/>
+      </w:rPr>
+    </w:lvl>
+  </w:abstractNum>
+  <w:abstractNum w:abstractNumId="17" w15:restartNumberingAfterBreak="0">
+    <w:nsid w:val="67BE2374"/>
+    <w:multiLevelType w:val="multilevel"/>
+    <w:tmpl w:val="A0CC5D26"/>
+    <w:lvl w:ilvl="0">
+      <w:start w:val="1"/>
+      <w:numFmt w:val="bullet"/>
+      <w:lvlText w:val=""/>
+      <w:lvlJc w:val="left"/>
+      <w:pPr>
+        <w:tabs>
+          <w:tab w:val="num" w:pos="720"/>
+        </w:tabs>
+        <w:ind w:left="720" w:hanging="360"/>
+      </w:pPr>
+      <w:rPr>
+        <w:rFonts w:ascii="Symbol" w:hAnsi="Symbol" w:hint="default"/>
+        <w:sz w:val="20"/>
+      </w:rPr>
+    </w:lvl>
+    <w:lvl w:ilvl="1" w:tentative="1">
+      <w:start w:val="1"/>
+      <w:numFmt w:val="bullet"/>
+      <w:lvlText w:val="o"/>
+      <w:lvlJc w:val="left"/>
+      <w:pPr>
+        <w:tabs>
+          <w:tab w:val="num" w:pos="1440"/>
+        </w:tabs>
+        <w:ind w:left="1440" w:hanging="360"/>
+      </w:pPr>
+      <w:rPr>
+        <w:rFonts w:ascii="Courier New" w:hAnsi="Courier New" w:hint="default"/>
+        <w:sz w:val="20"/>
+      </w:rPr>
+    </w:lvl>
+    <w:lvl w:ilvl="2" w:tentative="1">
+      <w:start w:val="1"/>
+      <w:numFmt w:val="bullet"/>
+      <w:lvlText w:val=""/>
+      <w:lvlJc w:val="left"/>
+      <w:pPr>
+        <w:tabs>
+          <w:tab w:val="num" w:pos="2160"/>
+        </w:tabs>
+        <w:ind w:left="2160" w:hanging="360"/>
+      </w:pPr>
+      <w:rPr>
+        <w:rFonts w:ascii="Wingdings" w:hAnsi="Wingdings" w:hint="default"/>
+        <w:sz w:val="20"/>
+      </w:rPr>
+    </w:lvl>
+    <w:lvl w:ilvl="3" w:tentative="1">
+      <w:start w:val="1"/>
+      <w:numFmt w:val="bullet"/>
+      <w:lvlText w:val=""/>
+      <w:lvlJc w:val="left"/>
+      <w:pPr>
+        <w:tabs>
+          <w:tab w:val="num" w:pos="2880"/>
+        </w:tabs>
+        <w:ind w:left="2880" w:hanging="360"/>
+      </w:pPr>
+      <w:rPr>
+        <w:rFonts w:ascii="Wingdings" w:hAnsi="Wingdings" w:hint="default"/>
+        <w:sz w:val="20"/>
+      </w:rPr>
+    </w:lvl>
+    <w:lvl w:ilvl="4" w:tentative="1">
+      <w:start w:val="1"/>
+      <w:numFmt w:val="bullet"/>
+      <w:lvlText w:val=""/>
+      <w:lvlJc w:val="left"/>
+      <w:pPr>
+        <w:tabs>
+          <w:tab w:val="num" w:pos="3600"/>
+        </w:tabs>
+        <w:ind w:left="3600" w:hanging="360"/>
+      </w:pPr>
+      <w:rPr>
+        <w:rFonts w:ascii="Wingdings" w:hAnsi="Wingdings" w:hint="default"/>
+        <w:sz w:val="20"/>
+      </w:rPr>
+    </w:lvl>
+    <w:lvl w:ilvl="5" w:tentative="1">
+      <w:start w:val="1"/>
+      <w:numFmt w:val="bullet"/>
+      <w:lvlText w:val=""/>
+      <w:lvlJc w:val="left"/>
+      <w:pPr>
+        <w:tabs>
+          <w:tab w:val="num" w:pos="4320"/>
+        </w:tabs>
+        <w:ind w:left="4320" w:hanging="360"/>
+      </w:pPr>
+      <w:rPr>
+        <w:rFonts w:ascii="Wingdings" w:hAnsi="Wingdings" w:hint="default"/>
+        <w:sz w:val="20"/>
+      </w:rPr>
+    </w:lvl>
+    <w:lvl w:ilvl="6" w:tentative="1">
+      <w:start w:val="1"/>
+      <w:numFmt w:val="bullet"/>
+      <w:lvlText w:val=""/>
+      <w:lvlJc w:val="left"/>
+      <w:pPr>
+        <w:tabs>
+          <w:tab w:val="num" w:pos="5040"/>
+        </w:tabs>
+        <w:ind w:left="5040" w:hanging="360"/>
+      </w:pPr>
+      <w:rPr>
+        <w:rFonts w:ascii="Wingdings" w:hAnsi="Wingdings" w:hint="default"/>
+        <w:sz w:val="20"/>
+      </w:rPr>
+    </w:lvl>
+    <w:lvl w:ilvl="7" w:tentative="1">
+      <w:start w:val="1"/>
+      <w:numFmt w:val="bullet"/>
+      <w:lvlText w:val=""/>
+      <w:lvlJc w:val="left"/>
+      <w:pPr>
+        <w:tabs>
+          <w:tab w:val="num" w:pos="5760"/>
+        </w:tabs>
+        <w:ind w:left="5760" w:hanging="360"/>
+      </w:pPr>
+      <w:rPr>
+        <w:rFonts w:ascii="Wingdings" w:hAnsi="Wingdings" w:hint="default"/>
+        <w:sz w:val="20"/>
+      </w:rPr>
+    </w:lvl>
+    <w:lvl w:ilvl="8" w:tentative="1">
+      <w:start w:val="1"/>
+      <w:numFmt w:val="bullet"/>
+      <w:lvlText w:val=""/>
+      <w:lvlJc w:val="left"/>
+      <w:pPr>
+        <w:tabs>
+          <w:tab w:val="num" w:pos="6480"/>
+        </w:tabs>
+        <w:ind w:left="6480" w:hanging="360"/>
+      </w:pPr>
+      <w:rPr>
+        <w:rFonts w:ascii="Wingdings" w:hAnsi="Wingdings" w:hint="default"/>
+        <w:sz w:val="20"/>
+      </w:rPr>
+    </w:lvl>
+  </w:abstractNum>
+  <w:abstractNum w:abstractNumId="18" w15:restartNumberingAfterBreak="0">
     <w:nsid w:val="69D43779"/>
     <w:multiLevelType w:val="multilevel"/>
     <w:tmpl w:val="AB8A3C66"/>
@@ -8603,7 +11745,156 @@
       </w:rPr>
     </w:lvl>
   </w:abstractNum>
-  <w:abstractNum w:abstractNumId="10" w15:restartNumberingAfterBreak="0">
+  <w:abstractNum w:abstractNumId="19" w15:restartNumberingAfterBreak="0">
+    <w:nsid w:val="69E53CBC"/>
+    <w:multiLevelType w:val="multilevel"/>
+    <w:tmpl w:val="807A66DA"/>
+    <w:lvl w:ilvl="0">
+      <w:start w:val="1"/>
+      <w:numFmt w:val="bullet"/>
+      <w:lvlText w:val=""/>
+      <w:lvlJc w:val="left"/>
+      <w:pPr>
+        <w:tabs>
+          <w:tab w:val="num" w:pos="720"/>
+        </w:tabs>
+        <w:ind w:left="720" w:hanging="360"/>
+      </w:pPr>
+      <w:rPr>
+        <w:rFonts w:ascii="Symbol" w:hAnsi="Symbol" w:hint="default"/>
+        <w:sz w:val="20"/>
+      </w:rPr>
+    </w:lvl>
+    <w:lvl w:ilvl="1" w:tentative="1">
+      <w:start w:val="1"/>
+      <w:numFmt w:val="bullet"/>
+      <w:lvlText w:val="o"/>
+      <w:lvlJc w:val="left"/>
+      <w:pPr>
+        <w:tabs>
+          <w:tab w:val="num" w:pos="1440"/>
+        </w:tabs>
+        <w:ind w:left="1440" w:hanging="360"/>
+      </w:pPr>
+      <w:rPr>
+        <w:rFonts w:ascii="Courier New" w:hAnsi="Courier New" w:hint="default"/>
+        <w:sz w:val="20"/>
+      </w:rPr>
+    </w:lvl>
+    <w:lvl w:ilvl="2" w:tentative="1">
+      <w:start w:val="1"/>
+      <w:numFmt w:val="bullet"/>
+      <w:lvlText w:val=""/>
+      <w:lvlJc w:val="left"/>
+      <w:pPr>
+        <w:tabs>
+          <w:tab w:val="num" w:pos="2160"/>
+        </w:tabs>
+        <w:ind w:left="2160" w:hanging="360"/>
+      </w:pPr>
+      <w:rPr>
+        <w:rFonts w:ascii="Wingdings" w:hAnsi="Wingdings" w:hint="default"/>
+        <w:sz w:val="20"/>
+      </w:rPr>
+    </w:lvl>
+    <w:lvl w:ilvl="3" w:tentative="1">
+      <w:start w:val="1"/>
+      <w:numFmt w:val="bullet"/>
+      <w:lvlText w:val=""/>
+      <w:lvlJc w:val="left"/>
+      <w:pPr>
+        <w:tabs>
+          <w:tab w:val="num" w:pos="2880"/>
+        </w:tabs>
+        <w:ind w:left="2880" w:hanging="360"/>
+      </w:pPr>
+      <w:rPr>
+        <w:rFonts w:ascii="Wingdings" w:hAnsi="Wingdings" w:hint="default"/>
+        <w:sz w:val="20"/>
+      </w:rPr>
+    </w:lvl>
+    <w:lvl w:ilvl="4" w:tentative="1">
+      <w:start w:val="1"/>
+      <w:numFmt w:val="bullet"/>
+      <w:lvlText w:val=""/>
+      <w:lvlJc w:val="left"/>
+      <w:pPr>
+        <w:tabs>
+          <w:tab w:val="num" w:pos="3600"/>
+        </w:tabs>
+        <w:ind w:left="3600" w:hanging="360"/>
+      </w:pPr>
+      <w:rPr>
+        <w:rFonts w:ascii="Wingdings" w:hAnsi="Wingdings" w:hint="default"/>
+        <w:sz w:val="20"/>
+      </w:rPr>
+    </w:lvl>
+    <w:lvl w:ilvl="5" w:tentative="1">
+      <w:start w:val="1"/>
+      <w:numFmt w:val="bullet"/>
+      <w:lvlText w:val=""/>
+      <w:lvlJc w:val="left"/>
+      <w:pPr>
+        <w:tabs>
+          <w:tab w:val="num" w:pos="4320"/>
+        </w:tabs>
+        <w:ind w:left="4320" w:hanging="360"/>
+      </w:pPr>
+      <w:rPr>
+        <w:rFonts w:ascii="Wingdings" w:hAnsi="Wingdings" w:hint="default"/>
+        <w:sz w:val="20"/>
+      </w:rPr>
+    </w:lvl>
+    <w:lvl w:ilvl="6" w:tentative="1">
+      <w:start w:val="1"/>
+      <w:numFmt w:val="bullet"/>
+      <w:lvlText w:val=""/>
+      <w:lvlJc w:val="left"/>
+      <w:pPr>
+        <w:tabs>
+          <w:tab w:val="num" w:pos="5040"/>
+        </w:tabs>
+        <w:ind w:left="5040" w:hanging="360"/>
+      </w:pPr>
+      <w:rPr>
+        <w:rFonts w:ascii="Wingdings" w:hAnsi="Wingdings" w:hint="default"/>
+        <w:sz w:val="20"/>
+      </w:rPr>
+    </w:lvl>
+    <w:lvl w:ilvl="7" w:tentative="1">
+      <w:start w:val="1"/>
+      <w:numFmt w:val="bullet"/>
+      <w:lvlText w:val=""/>
+      <w:lvlJc w:val="left"/>
+      <w:pPr>
+        <w:tabs>
+          <w:tab w:val="num" w:pos="5760"/>
+        </w:tabs>
+        <w:ind w:left="5760" w:hanging="360"/>
+      </w:pPr>
+      <w:rPr>
+        <w:rFonts w:ascii="Wingdings" w:hAnsi="Wingdings" w:hint="default"/>
+        <w:sz w:val="20"/>
+      </w:rPr>
+    </w:lvl>
+    <w:lvl w:ilvl="8" w:tentative="1">
+      <w:start w:val="1"/>
+      <w:numFmt w:val="bullet"/>
+      <w:lvlText w:val=""/>
+      <w:lvlJc w:val="left"/>
+      <w:pPr>
+        <w:tabs>
+          <w:tab w:val="num" w:pos="6480"/>
+        </w:tabs>
+        <w:ind w:left="6480" w:hanging="360"/>
+      </w:pPr>
+      <w:rPr>
+        <w:rFonts w:ascii="Wingdings" w:hAnsi="Wingdings" w:hint="default"/>
+        <w:sz w:val="20"/>
+      </w:rPr>
+    </w:lvl>
+  </w:abstractNum>
+  <w:abstractNum w:abstractNumId="20" w15:restartNumberingAfterBreak="0">
     <w:nsid w:val="6E852D42"/>
     <w:multiLevelType w:val="multilevel"/>
     <w:tmpl w:val="DE98FF42"/>
@@ -8752,7 +12043,7 @@
       </w:rPr>
     </w:lvl>
   </w:abstractNum>
-  <w:abstractNum w:abstractNumId="11" w15:restartNumberingAfterBreak="0">
+  <w:abstractNum w:abstractNumId="21" w15:restartNumberingAfterBreak="0">
     <w:nsid w:val="74FF3671"/>
     <w:multiLevelType w:val="multilevel"/>
     <w:tmpl w:val="A136319A"/>
@@ -8865,7 +12156,7 @@
       </w:pPr>
     </w:lvl>
   </w:abstractNum>
-  <w:abstractNum w:abstractNumId="12" w15:restartNumberingAfterBreak="0">
+  <w:abstractNum w:abstractNumId="22" w15:restartNumberingAfterBreak="0">
     <w:nsid w:val="79E47D5A"/>
     <w:multiLevelType w:val="multilevel"/>
     <w:tmpl w:val="6ED2D598"/>
@@ -8978,7 +12269,7 @@
       </w:pPr>
     </w:lvl>
   </w:abstractNum>
-  <w:abstractNum w:abstractNumId="13" w15:restartNumberingAfterBreak="0">
+  <w:abstractNum w:abstractNumId="23" w15:restartNumberingAfterBreak="0">
     <w:nsid w:val="7D2C6395"/>
     <w:multiLevelType w:val="multilevel"/>
     <w:tmpl w:val="4D24B1C8"/>
@@ -9091,7 +12382,7 @@
       </w:pPr>
     </w:lvl>
   </w:abstractNum>
-  <w:abstractNum w:abstractNumId="14" w15:restartNumberingAfterBreak="0">
+  <w:abstractNum w:abstractNumId="24" w15:restartNumberingAfterBreak="0">
     <w:nsid w:val="7EA13F7F"/>
     <w:multiLevelType w:val="multilevel"/>
     <w:tmpl w:val="50007C38"/>
@@ -9241,49 +12532,79 @@
     </w:lvl>
   </w:abstractNum>
   <w:num w:numId="1" w16cid:durableId="1833794355">
+    <w:abstractNumId w:val="24"/>
+  </w:num>
+  <w:num w:numId="2" w16cid:durableId="1855264537">
+    <w:abstractNumId w:val="5"/>
+  </w:num>
+  <w:num w:numId="3" w16cid:durableId="811868064">
     <w:abstractNumId w:val="14"/>
   </w:num>
-  <w:num w:numId="2" w16cid:durableId="1855264537">
+  <w:num w:numId="4" w16cid:durableId="806624254">
+    <w:abstractNumId w:val="21"/>
+  </w:num>
+  <w:num w:numId="5" w16cid:durableId="681005128">
+    <w:abstractNumId w:val="6"/>
+  </w:num>
+  <w:num w:numId="6" w16cid:durableId="1907064560">
+    <w:abstractNumId w:val="7"/>
+  </w:num>
+  <w:num w:numId="7" w16cid:durableId="366836330">
+    <w:abstractNumId w:val="13"/>
+  </w:num>
+  <w:num w:numId="8" w16cid:durableId="1217397248">
+    <w:abstractNumId w:val="2"/>
+  </w:num>
+  <w:num w:numId="9" w16cid:durableId="851601237">
+    <w:abstractNumId w:val="18"/>
+  </w:num>
+  <w:num w:numId="10" w16cid:durableId="1771849238">
+    <w:abstractNumId w:val="23"/>
+  </w:num>
+  <w:num w:numId="11" w16cid:durableId="269095163">
+    <w:abstractNumId w:val="20"/>
+  </w:num>
+  <w:num w:numId="12" w16cid:durableId="1221819224">
+    <w:abstractNumId w:val="10"/>
+  </w:num>
+  <w:num w:numId="13" w16cid:durableId="399056790">
+    <w:abstractNumId w:val="11"/>
+  </w:num>
+  <w:num w:numId="14" w16cid:durableId="1549144346">
+    <w:abstractNumId w:val="22"/>
+  </w:num>
+  <w:num w:numId="15" w16cid:durableId="13921230">
+    <w:abstractNumId w:val="15"/>
+  </w:num>
+  <w:num w:numId="16" w16cid:durableId="1719280292">
+    <w:abstractNumId w:val="3"/>
+  </w:num>
+  <w:num w:numId="17" w16cid:durableId="615868156">
+    <w:abstractNumId w:val="12"/>
+  </w:num>
+  <w:num w:numId="18" w16cid:durableId="997196500">
+    <w:abstractNumId w:val="4"/>
+  </w:num>
+  <w:num w:numId="19" w16cid:durableId="627005282">
+    <w:abstractNumId w:val="9"/>
+  </w:num>
+  <w:num w:numId="20" w16cid:durableId="1585871218">
     <w:abstractNumId w:val="1"/>
   </w:num>
-  <w:num w:numId="3" w16cid:durableId="811868064">
-    <w:abstractNumId w:val="7"/>
+  <w:num w:numId="21" w16cid:durableId="342825927">
+    <w:abstractNumId w:val="19"/>
   </w:num>
-  <w:num w:numId="4" w16cid:durableId="806624254">
-    <w:abstractNumId w:val="11"/>
+  <w:num w:numId="22" w16cid:durableId="50084827">
+    <w:abstractNumId w:val="16"/>
   </w:num>
-  <w:num w:numId="5" w16cid:durableId="681005128">
-    <w:abstractNumId w:val="2"/>
-  </w:num>
-  <w:num w:numId="6" w16cid:durableId="1907064560">
-    <w:abstractNumId w:val="3"/>
-  </w:num>
-  <w:num w:numId="7" w16cid:durableId="366836330">
-    <w:abstractNumId w:val="6"/>
-  </w:num>
-  <w:num w:numId="8" w16cid:durableId="1217397248">
+  <w:num w:numId="23" w16cid:durableId="746920206">
     <w:abstractNumId w:val="0"/>
   </w:num>
-  <w:num w:numId="9" w16cid:durableId="851601237">
-    <w:abstractNumId w:val="9"/>
+  <w:num w:numId="24" w16cid:durableId="782572191">
+    <w:abstractNumId w:val="8"/>
   </w:num>
-  <w:num w:numId="10" w16cid:durableId="1771849238">
-    <w:abstractNumId w:val="13"/>
-  </w:num>
-  <w:num w:numId="11" w16cid:durableId="269095163">
-    <w:abstractNumId w:val="10"/>
-  </w:num>
-  <w:num w:numId="12" w16cid:durableId="1221819224">
-    <w:abstractNumId w:val="4"/>
-  </w:num>
-  <w:num w:numId="13" w16cid:durableId="399056790">
-    <w:abstractNumId w:val="5"/>
-  </w:num>
-  <w:num w:numId="14" w16cid:durableId="1549144346">
-    <w:abstractNumId w:val="12"/>
-  </w:num>
-  <w:num w:numId="15" w16cid:durableId="13921230">
-    <w:abstractNumId w:val="8"/>
+  <w:num w:numId="25" w16cid:durableId="25177590">
+    <w:abstractNumId w:val="17"/>
   </w:num>
 </w:numbering>
 </file>

</xml_diff>